<commit_message>
fix: harden skill runtime and validation
</commit_message>
<xml_diff>
--- a/skills/phong-cntt/assets/bbnt-khoi-luong-hoan-thanh.docx
+++ b/skills/phong-cntt/assets/bbnt-khoi-luong-hoan-thanh.docx
@@ -1,6 +1,6 @@
 
 <file path=word/document.xml><?xml version="1.0" encoding="utf-8"?>
-<w:document xmlns:ns1="http://schemas.openxmlformats.org/markup-compatibility/2006" xmlns:ns2="http://schemas.microsoft.com/office/word/2010/wordml" xmlns:ns3="http://schemas.openxmlformats.org/officeDocument/2006/relationships" xmlns:w="http://schemas.openxmlformats.org/wordprocessingml/2006/main" ns1:Ignorable="w14 w15 w16se w16cid w16 w16cex w16sdtdh wp14">
+<w:document xmlns:ns1="http://schemas.openxmlformats.org/markup-compatibility/2006" xmlns:ns2="http://schemas.microsoft.com/office/word/2010/wordml" xmlns:ns3="http://schemas.openxmlformats.org/officeDocument/2006/relationships" xmlns:w="http://schemas.openxmlformats.org/wordprocessingml/2006/main">
   <w:body>
     <w:p ns2:paraId="7E6EF765" ns2:textId="77777777">
       <w:pPr>
@@ -12391,7 +12391,7 @@
 </file>
 
 <file path=word/endnotes.xml><?xml version="1.0" encoding="utf-8"?>
-<w:endnotes xmlns:wpc="http://schemas.microsoft.com/office/word/2010/wordprocessingCanvas" xmlns:cx="http://schemas.microsoft.com/office/drawing/2014/chartex" xmlns:cx1="http://schemas.microsoft.com/office/drawing/2015/9/8/chartex" xmlns:cx2="http://schemas.microsoft.com/office/drawing/2015/10/21/chartex" xmlns:cx3="http://schemas.microsoft.com/office/drawing/2016/5/9/chartex" xmlns:cx4="http://schemas.microsoft.com/office/drawing/2016/5/10/chartex" xmlns:cx5="http://schemas.microsoft.com/office/drawing/2016/5/11/chartex" xmlns:cx6="http://schemas.microsoft.com/office/drawing/2016/5/12/chartex" xmlns:cx7="http://schemas.microsoft.com/office/drawing/2016/5/13/chartex" xmlns:cx8="http://schemas.microsoft.com/office/drawing/2016/5/14/chartex" xmlns:mc="http://schemas.openxmlformats.org/markup-compatibility/2006" xmlns:aink="http://schemas.microsoft.com/office/drawing/2016/ink" xmlns:am3d="http://schemas.microsoft.com/office/drawing/2017/model3d" xmlns:o="urn:schemas-microsoft-com:office:office" xmlns:r="http://schemas.openxmlformats.org/officeDocument/2006/relationships" xmlns:m="http://schemas.openxmlformats.org/officeDocument/2006/math" xmlns:v="urn:schemas-microsoft-com:vml" xmlns:wp14="http://schemas.microsoft.com/office/word/2010/wordprocessingDrawing" xmlns:wp="http://schemas.openxmlformats.org/drawingml/2006/wordprocessingDrawing" xmlns:w10="urn:schemas-microsoft-com:office:word" xmlns:w="http://schemas.openxmlformats.org/wordprocessingml/2006/main" xmlns:w14="http://schemas.microsoft.com/office/word/2010/wordml" xmlns:w15="http://schemas.microsoft.com/office/word/2012/wordml" xmlns:w16cex="http://schemas.microsoft.com/office/word/2018/wordml/cex" xmlns:w16cid="http://schemas.microsoft.com/office/word/2016/wordml/cid" xmlns:w16="http://schemas.microsoft.com/office/word/2018/wordml" xmlns:w16sdtdh="http://schemas.microsoft.com/office/word/2020/wordml/sdtdatahash" xmlns:w16se="http://schemas.microsoft.com/office/word/2015/wordml/symex" xmlns:wpg="http://schemas.microsoft.com/office/word/2010/wordprocessingGroup" xmlns:wpi="http://schemas.microsoft.com/office/word/2010/wordprocessingInk" xmlns:wne="http://schemas.microsoft.com/office/word/2006/wordml" xmlns:wps="http://schemas.microsoft.com/office/word/2010/wordprocessingShape" mc:Ignorable="w14 w15 w16se w16cid w16 w16cex w16sdtdh wp14">
+<w:endnotes xmlns:wpc="http://schemas.microsoft.com/office/word/2010/wordprocessingCanvas" xmlns:cx="http://schemas.microsoft.com/office/drawing/2014/chartex" xmlns:cx1="http://schemas.microsoft.com/office/drawing/2015/9/8/chartex" xmlns:cx2="http://schemas.microsoft.com/office/drawing/2015/10/21/chartex" xmlns:cx3="http://schemas.microsoft.com/office/drawing/2016/5/9/chartex" xmlns:cx4="http://schemas.microsoft.com/office/drawing/2016/5/10/chartex" xmlns:cx5="http://schemas.microsoft.com/office/drawing/2016/5/11/chartex" xmlns:cx6="http://schemas.microsoft.com/office/drawing/2016/5/12/chartex" xmlns:cx7="http://schemas.microsoft.com/office/drawing/2016/5/13/chartex" xmlns:cx8="http://schemas.microsoft.com/office/drawing/2016/5/14/chartex" xmlns:mc="http://schemas.openxmlformats.org/markup-compatibility/2006" xmlns:aink="http://schemas.microsoft.com/office/drawing/2016/ink" xmlns:am3d="http://schemas.microsoft.com/office/drawing/2017/model3d" xmlns:o="urn:schemas-microsoft-com:office:office" xmlns:r="http://schemas.openxmlformats.org/officeDocument/2006/relationships" xmlns:m="http://schemas.openxmlformats.org/officeDocument/2006/math" xmlns:v="urn:schemas-microsoft-com:vml" xmlns:wp14="http://schemas.microsoft.com/office/word/2010/wordprocessingDrawing" xmlns:wp="http://schemas.openxmlformats.org/drawingml/2006/wordprocessingDrawing" xmlns:w10="urn:schemas-microsoft-com:office:word" xmlns:w="http://schemas.openxmlformats.org/wordprocessingml/2006/main" xmlns:w14="http://schemas.microsoft.com/office/word/2010/wordml" xmlns:w15="http://schemas.microsoft.com/office/word/2012/wordml" xmlns:w16cex="http://schemas.microsoft.com/office/word/2018/wordml/cex" xmlns:w16="http://schemas.microsoft.com/office/word/2018/wordml" xmlns:w16sdtdh="http://schemas.microsoft.com/office/word/2020/wordml/sdtdatahash" xmlns:w16se="http://schemas.microsoft.com/office/word/2015/wordml/symex" xmlns:wpg="http://schemas.microsoft.com/office/word/2010/wordprocessingGroup" xmlns:wpi="http://schemas.microsoft.com/office/word/2010/wordprocessingInk" xmlns:wne="http://schemas.microsoft.com/office/word/2006/wordml" xmlns:wps="http://schemas.microsoft.com/office/word/2010/wordprocessingShape">
   <w:endnote w:type="separator" w:id="-1">
     <w:p>
       <w:r>
@@ -12410,7 +12410,7 @@
 </file>
 
 <file path=word/footer1.xml><?xml version="1.0" encoding="utf-8"?>
-<w:ftr xmlns:wpc="http://schemas.microsoft.com/office/word/2010/wordprocessingCanvas" xmlns:cx="http://schemas.microsoft.com/office/drawing/2014/chartex" xmlns:cx1="http://schemas.microsoft.com/office/drawing/2015/9/8/chartex" xmlns:cx2="http://schemas.microsoft.com/office/drawing/2015/10/21/chartex" xmlns:cx3="http://schemas.microsoft.com/office/drawing/2016/5/9/chartex" xmlns:cx4="http://schemas.microsoft.com/office/drawing/2016/5/10/chartex" xmlns:cx5="http://schemas.microsoft.com/office/drawing/2016/5/11/chartex" xmlns:cx6="http://schemas.microsoft.com/office/drawing/2016/5/12/chartex" xmlns:cx7="http://schemas.microsoft.com/office/drawing/2016/5/13/chartex" xmlns:cx8="http://schemas.microsoft.com/office/drawing/2016/5/14/chartex" xmlns:mc="http://schemas.openxmlformats.org/markup-compatibility/2006" xmlns:aink="http://schemas.microsoft.com/office/drawing/2016/ink" xmlns:am3d="http://schemas.microsoft.com/office/drawing/2017/model3d" xmlns:o="urn:schemas-microsoft-com:office:office" xmlns:r="http://schemas.openxmlformats.org/officeDocument/2006/relationships" xmlns:m="http://schemas.openxmlformats.org/officeDocument/2006/math" xmlns:v="urn:schemas-microsoft-com:vml" xmlns:wp14="http://schemas.microsoft.com/office/word/2010/wordprocessingDrawing" xmlns:wp="http://schemas.openxmlformats.org/drawingml/2006/wordprocessingDrawing" xmlns:w10="urn:schemas-microsoft-com:office:word" xmlns:w="http://schemas.openxmlformats.org/wordprocessingml/2006/main" xmlns:w14="http://schemas.microsoft.com/office/word/2010/wordml" xmlns:w15="http://schemas.microsoft.com/office/word/2012/wordml" xmlns:w16cex="http://schemas.microsoft.com/office/word/2018/wordml/cex" xmlns:w16cid="http://schemas.microsoft.com/office/word/2016/wordml/cid" xmlns:w16="http://schemas.microsoft.com/office/word/2018/wordml" xmlns:w16sdtdh="http://schemas.microsoft.com/office/word/2020/wordml/sdtdatahash" xmlns:w16se="http://schemas.microsoft.com/office/word/2015/wordml/symex" xmlns:wpg="http://schemas.microsoft.com/office/word/2010/wordprocessingGroup" xmlns:wpi="http://schemas.microsoft.com/office/word/2010/wordprocessingInk" xmlns:wne="http://schemas.microsoft.com/office/word/2006/wordml" xmlns:wps="http://schemas.microsoft.com/office/word/2010/wordprocessingShape" mc:Ignorable="w14 w15 w16se w16cid w16 w16cex w16sdtdh wp14">
+<w:ftr xmlns:wpc="http://schemas.microsoft.com/office/word/2010/wordprocessingCanvas" xmlns:cx="http://schemas.microsoft.com/office/drawing/2014/chartex" xmlns:cx1="http://schemas.microsoft.com/office/drawing/2015/9/8/chartex" xmlns:cx2="http://schemas.microsoft.com/office/drawing/2015/10/21/chartex" xmlns:cx3="http://schemas.microsoft.com/office/drawing/2016/5/9/chartex" xmlns:cx4="http://schemas.microsoft.com/office/drawing/2016/5/10/chartex" xmlns:cx5="http://schemas.microsoft.com/office/drawing/2016/5/11/chartex" xmlns:cx6="http://schemas.microsoft.com/office/drawing/2016/5/12/chartex" xmlns:cx7="http://schemas.microsoft.com/office/drawing/2016/5/13/chartex" xmlns:cx8="http://schemas.microsoft.com/office/drawing/2016/5/14/chartex" xmlns:mc="http://schemas.openxmlformats.org/markup-compatibility/2006" xmlns:aink="http://schemas.microsoft.com/office/drawing/2016/ink" xmlns:am3d="http://schemas.microsoft.com/office/drawing/2017/model3d" xmlns:o="urn:schemas-microsoft-com:office:office" xmlns:r="http://schemas.openxmlformats.org/officeDocument/2006/relationships" xmlns:m="http://schemas.openxmlformats.org/officeDocument/2006/math" xmlns:v="urn:schemas-microsoft-com:vml" xmlns:wp14="http://schemas.microsoft.com/office/word/2010/wordprocessingDrawing" xmlns:wp="http://schemas.openxmlformats.org/drawingml/2006/wordprocessingDrawing" xmlns:w10="urn:schemas-microsoft-com:office:word" xmlns:w="http://schemas.openxmlformats.org/wordprocessingml/2006/main" xmlns:w14="http://schemas.microsoft.com/office/word/2010/wordml" xmlns:w15="http://schemas.microsoft.com/office/word/2012/wordml" xmlns:w16cex="http://schemas.microsoft.com/office/word/2018/wordml/cex" xmlns:w16="http://schemas.microsoft.com/office/word/2018/wordml" xmlns:w16sdtdh="http://schemas.microsoft.com/office/word/2020/wordml/sdtdatahash" xmlns:w16se="http://schemas.microsoft.com/office/word/2015/wordml/symex" xmlns:wpg="http://schemas.microsoft.com/office/word/2010/wordprocessingGroup" xmlns:wpi="http://schemas.microsoft.com/office/word/2010/wordprocessingInk" xmlns:wne="http://schemas.microsoft.com/office/word/2006/wordml" xmlns:wps="http://schemas.microsoft.com/office/word/2010/wordprocessingShape">
   <w:p>
     <w:pPr>
       <w:pStyle w:val="Footer"/>
@@ -12420,7 +12420,7 @@
 </file>
 
 <file path=word/footnotes.xml><?xml version="1.0" encoding="utf-8"?>
-<w:footnotes xmlns:wpc="http://schemas.microsoft.com/office/word/2010/wordprocessingCanvas" xmlns:cx="http://schemas.microsoft.com/office/drawing/2014/chartex" xmlns:cx1="http://schemas.microsoft.com/office/drawing/2015/9/8/chartex" xmlns:cx2="http://schemas.microsoft.com/office/drawing/2015/10/21/chartex" xmlns:cx3="http://schemas.microsoft.com/office/drawing/2016/5/9/chartex" xmlns:cx4="http://schemas.microsoft.com/office/drawing/2016/5/10/chartex" xmlns:cx5="http://schemas.microsoft.com/office/drawing/2016/5/11/chartex" xmlns:cx6="http://schemas.microsoft.com/office/drawing/2016/5/12/chartex" xmlns:cx7="http://schemas.microsoft.com/office/drawing/2016/5/13/chartex" xmlns:cx8="http://schemas.microsoft.com/office/drawing/2016/5/14/chartex" xmlns:mc="http://schemas.openxmlformats.org/markup-compatibility/2006" xmlns:aink="http://schemas.microsoft.com/office/drawing/2016/ink" xmlns:am3d="http://schemas.microsoft.com/office/drawing/2017/model3d" xmlns:o="urn:schemas-microsoft-com:office:office" xmlns:r="http://schemas.openxmlformats.org/officeDocument/2006/relationships" xmlns:m="http://schemas.openxmlformats.org/officeDocument/2006/math" xmlns:v="urn:schemas-microsoft-com:vml" xmlns:wp14="http://schemas.microsoft.com/office/word/2010/wordprocessingDrawing" xmlns:wp="http://schemas.openxmlformats.org/drawingml/2006/wordprocessingDrawing" xmlns:w10="urn:schemas-microsoft-com:office:word" xmlns:w="http://schemas.openxmlformats.org/wordprocessingml/2006/main" xmlns:w14="http://schemas.microsoft.com/office/word/2010/wordml" xmlns:w15="http://schemas.microsoft.com/office/word/2012/wordml" xmlns:w16cex="http://schemas.microsoft.com/office/word/2018/wordml/cex" xmlns:w16cid="http://schemas.microsoft.com/office/word/2016/wordml/cid" xmlns:w16="http://schemas.microsoft.com/office/word/2018/wordml" xmlns:w16sdtdh="http://schemas.microsoft.com/office/word/2020/wordml/sdtdatahash" xmlns:w16se="http://schemas.microsoft.com/office/word/2015/wordml/symex" xmlns:wpg="http://schemas.microsoft.com/office/word/2010/wordprocessingGroup" xmlns:wpi="http://schemas.microsoft.com/office/word/2010/wordprocessingInk" xmlns:wne="http://schemas.microsoft.com/office/word/2006/wordml" xmlns:wps="http://schemas.microsoft.com/office/word/2010/wordprocessingShape" mc:Ignorable="w14 w15 w16se w16cid w16 w16cex w16sdtdh wp14">
+<w:footnotes xmlns:wpc="http://schemas.microsoft.com/office/word/2010/wordprocessingCanvas" xmlns:cx="http://schemas.microsoft.com/office/drawing/2014/chartex" xmlns:cx1="http://schemas.microsoft.com/office/drawing/2015/9/8/chartex" xmlns:cx2="http://schemas.microsoft.com/office/drawing/2015/10/21/chartex" xmlns:cx3="http://schemas.microsoft.com/office/drawing/2016/5/9/chartex" xmlns:cx4="http://schemas.microsoft.com/office/drawing/2016/5/10/chartex" xmlns:cx5="http://schemas.microsoft.com/office/drawing/2016/5/11/chartex" xmlns:cx6="http://schemas.microsoft.com/office/drawing/2016/5/12/chartex" xmlns:cx7="http://schemas.microsoft.com/office/drawing/2016/5/13/chartex" xmlns:cx8="http://schemas.microsoft.com/office/drawing/2016/5/14/chartex" xmlns:mc="http://schemas.openxmlformats.org/markup-compatibility/2006" xmlns:aink="http://schemas.microsoft.com/office/drawing/2016/ink" xmlns:am3d="http://schemas.microsoft.com/office/drawing/2017/model3d" xmlns:o="urn:schemas-microsoft-com:office:office" xmlns:r="http://schemas.openxmlformats.org/officeDocument/2006/relationships" xmlns:m="http://schemas.openxmlformats.org/officeDocument/2006/math" xmlns:v="urn:schemas-microsoft-com:vml" xmlns:wp14="http://schemas.microsoft.com/office/word/2010/wordprocessingDrawing" xmlns:wp="http://schemas.openxmlformats.org/drawingml/2006/wordprocessingDrawing" xmlns:w10="urn:schemas-microsoft-com:office:word" xmlns:w="http://schemas.openxmlformats.org/wordprocessingml/2006/main" xmlns:w14="http://schemas.microsoft.com/office/word/2010/wordml" xmlns:w15="http://schemas.microsoft.com/office/word/2012/wordml" xmlns:w16cex="http://schemas.microsoft.com/office/word/2018/wordml/cex" xmlns:w16="http://schemas.microsoft.com/office/word/2018/wordml" xmlns:w16sdtdh="http://schemas.microsoft.com/office/word/2020/wordml/sdtdatahash" xmlns:w16se="http://schemas.microsoft.com/office/word/2015/wordml/symex" xmlns:wpg="http://schemas.microsoft.com/office/word/2010/wordprocessingGroup" xmlns:wpi="http://schemas.microsoft.com/office/word/2010/wordprocessingInk" xmlns:wne="http://schemas.microsoft.com/office/word/2006/wordml" xmlns:wps="http://schemas.microsoft.com/office/word/2010/wordprocessingShape">
   <w:footnote w:type="separator" w:id="-1">
     <w:p>
       <w:r>
@@ -12439,8 +12439,8 @@
 </file>
 
 <file path=word/numbering.xml><?xml version="1.0" encoding="utf-8"?>
-<w:numbering xmlns:wpc="http://schemas.microsoft.com/office/word/2010/wordprocessingCanvas" xmlns:cx="http://schemas.microsoft.com/office/drawing/2014/chartex" xmlns:cx1="http://schemas.microsoft.com/office/drawing/2015/9/8/chartex" xmlns:cx2="http://schemas.microsoft.com/office/drawing/2015/10/21/chartex" xmlns:cx3="http://schemas.microsoft.com/office/drawing/2016/5/9/chartex" xmlns:cx4="http://schemas.microsoft.com/office/drawing/2016/5/10/chartex" xmlns:cx5="http://schemas.microsoft.com/office/drawing/2016/5/11/chartex" xmlns:cx6="http://schemas.microsoft.com/office/drawing/2016/5/12/chartex" xmlns:cx7="http://schemas.microsoft.com/office/drawing/2016/5/13/chartex" xmlns:cx8="http://schemas.microsoft.com/office/drawing/2016/5/14/chartex" xmlns:mc="http://schemas.openxmlformats.org/markup-compatibility/2006" xmlns:aink="http://schemas.microsoft.com/office/drawing/2016/ink" xmlns:am3d="http://schemas.microsoft.com/office/drawing/2017/model3d" xmlns:o="urn:schemas-microsoft-com:office:office" xmlns:r="http://schemas.openxmlformats.org/officeDocument/2006/relationships" xmlns:m="http://schemas.openxmlformats.org/officeDocument/2006/math" xmlns:v="urn:schemas-microsoft-com:vml" xmlns:wp14="http://schemas.microsoft.com/office/word/2010/wordprocessingDrawing" xmlns:wp="http://schemas.openxmlformats.org/drawingml/2006/wordprocessingDrawing" xmlns:w10="urn:schemas-microsoft-com:office:word" xmlns:w="http://schemas.openxmlformats.org/wordprocessingml/2006/main" xmlns:w14="http://schemas.microsoft.com/office/word/2010/wordml" xmlns:w15="http://schemas.microsoft.com/office/word/2012/wordml" xmlns:w16cex="http://schemas.microsoft.com/office/word/2018/wordml/cex" xmlns:w16cid="http://schemas.microsoft.com/office/word/2016/wordml/cid" xmlns:w16="http://schemas.microsoft.com/office/word/2018/wordml" xmlns:w16sdtdh="http://schemas.microsoft.com/office/word/2020/wordml/sdtdatahash" xmlns:w16se="http://schemas.microsoft.com/office/word/2015/wordml/symex" xmlns:wpg="http://schemas.microsoft.com/office/word/2010/wordprocessingGroup" xmlns:wpi="http://schemas.microsoft.com/office/word/2010/wordprocessingInk" xmlns:wne="http://schemas.microsoft.com/office/word/2006/wordml" xmlns:wps="http://schemas.microsoft.com/office/word/2010/wordprocessingShape" mc:Ignorable="w14 w15 w16se w16cid w16 w16cex w16sdtdh wp14">
-  <w:abstractNum w:abstractNumId="0" w15:restartNumberingAfterBreak="0">
+<w:numbering xmlns:wpc="http://schemas.microsoft.com/office/word/2010/wordprocessingCanvas" xmlns:cx="http://schemas.microsoft.com/office/drawing/2014/chartex" xmlns:cx1="http://schemas.microsoft.com/office/drawing/2015/9/8/chartex" xmlns:cx2="http://schemas.microsoft.com/office/drawing/2015/10/21/chartex" xmlns:cx3="http://schemas.microsoft.com/office/drawing/2016/5/9/chartex" xmlns:cx4="http://schemas.microsoft.com/office/drawing/2016/5/10/chartex" xmlns:cx5="http://schemas.microsoft.com/office/drawing/2016/5/11/chartex" xmlns:cx6="http://schemas.microsoft.com/office/drawing/2016/5/12/chartex" xmlns:cx7="http://schemas.microsoft.com/office/drawing/2016/5/13/chartex" xmlns:cx8="http://schemas.microsoft.com/office/drawing/2016/5/14/chartex" xmlns:mc="http://schemas.openxmlformats.org/markup-compatibility/2006" xmlns:aink="http://schemas.microsoft.com/office/drawing/2016/ink" xmlns:am3d="http://schemas.microsoft.com/office/drawing/2017/model3d" xmlns:o="urn:schemas-microsoft-com:office:office" xmlns:r="http://schemas.openxmlformats.org/officeDocument/2006/relationships" xmlns:m="http://schemas.openxmlformats.org/officeDocument/2006/math" xmlns:v="urn:schemas-microsoft-com:vml" xmlns:wp14="http://schemas.microsoft.com/office/word/2010/wordprocessingDrawing" xmlns:wp="http://schemas.openxmlformats.org/drawingml/2006/wordprocessingDrawing" xmlns:w10="urn:schemas-microsoft-com:office:word" xmlns:w="http://schemas.openxmlformats.org/wordprocessingml/2006/main" xmlns:w14="http://schemas.microsoft.com/office/word/2010/wordml" xmlns:w15="http://schemas.microsoft.com/office/word/2012/wordml" xmlns:w16cex="http://schemas.microsoft.com/office/word/2018/wordml/cex" xmlns:w16="http://schemas.microsoft.com/office/word/2018/wordml" xmlns:w16sdtdh="http://schemas.microsoft.com/office/word/2020/wordml/sdtdatahash" xmlns:w16se="http://schemas.microsoft.com/office/word/2015/wordml/symex" xmlns:wpg="http://schemas.microsoft.com/office/word/2010/wordprocessingGroup" xmlns:wpi="http://schemas.microsoft.com/office/word/2010/wordprocessingInk" xmlns:wne="http://schemas.microsoft.com/office/word/2006/wordml" xmlns:wps="http://schemas.microsoft.com/office/word/2010/wordprocessingShape">
+  <w:abstractNum w:abstractNumId="0">
     <w:nsid w:val="09842C46"/>
     <w:multiLevelType w:val="hybridMultilevel"/>
     <w:tmpl w:val="BD945E98"/>
@@ -12556,7 +12556,7 @@
       </w:pPr>
     </w:lvl>
   </w:abstractNum>
-  <w:abstractNum w:abstractNumId="1" w15:restartNumberingAfterBreak="0">
+  <w:abstractNum w:abstractNumId="1">
     <w:nsid w:val="1C867597"/>
     <w:multiLevelType w:val="hybridMultilevel"/>
     <w:tmpl w:val="D68E88BE"/>
@@ -12670,7 +12670,7 @@
       </w:rPr>
     </w:lvl>
   </w:abstractNum>
-  <w:abstractNum w:abstractNumId="2" w15:restartNumberingAfterBreak="0">
+  <w:abstractNum w:abstractNumId="2">
     <w:nsid w:val="20D24CD7"/>
     <w:multiLevelType w:val="hybridMultilevel"/>
     <w:tmpl w:val="41C6B320"/>
@@ -12783,7 +12783,7 @@
       </w:rPr>
     </w:lvl>
   </w:abstractNum>
-  <w:abstractNum w:abstractNumId="3" w15:restartNumberingAfterBreak="0">
+  <w:abstractNum w:abstractNumId="3">
     <w:nsid w:val="26484061"/>
     <w:multiLevelType w:val="hybridMultilevel"/>
     <w:tmpl w:val="2278AE5C"/>
@@ -12873,7 +12873,7 @@
       </w:pPr>
     </w:lvl>
   </w:abstractNum>
-  <w:abstractNum w:abstractNumId="4" w15:restartNumberingAfterBreak="0">
+  <w:abstractNum w:abstractNumId="4">
     <w:nsid w:val="304B68A4"/>
     <w:multiLevelType w:val="hybridMultilevel"/>
     <w:tmpl w:val="FE1075E8"/>
@@ -13012,7 +13012,7 @@
       </w:rPr>
     </w:lvl>
   </w:abstractNum>
-  <w:abstractNum w:abstractNumId="5" w15:restartNumberingAfterBreak="0">
+  <w:abstractNum w:abstractNumId="5">
     <w:nsid w:val="3EBE4479"/>
     <w:multiLevelType w:val="hybridMultilevel"/>
     <w:tmpl w:val="EFE01DEE"/>
@@ -13102,7 +13102,7 @@
       </w:pPr>
     </w:lvl>
   </w:abstractNum>
-  <w:abstractNum w:abstractNumId="6" w15:restartNumberingAfterBreak="0">
+  <w:abstractNum w:abstractNumId="6">
     <w:nsid w:val="5E524890"/>
     <w:multiLevelType w:val="multilevel"/>
     <w:tmpl w:val="FE1075E8"/>
@@ -13241,7 +13241,7 @@
       </w:rPr>
     </w:lvl>
   </w:abstractNum>
-  <w:abstractNum w:abstractNumId="7" w15:restartNumberingAfterBreak="0">
+  <w:abstractNum w:abstractNumId="7">
     <w:nsid w:val="5FBF77DE"/>
     <w:multiLevelType w:val="hybridMultilevel"/>
     <w:tmpl w:val="1F0EA556"/>
@@ -13357,7 +13357,7 @@
       </w:pPr>
     </w:lvl>
   </w:abstractNum>
-  <w:abstractNum w:abstractNumId="8" w15:restartNumberingAfterBreak="0">
+  <w:abstractNum w:abstractNumId="8">
     <w:nsid w:val="64236AAA"/>
     <w:multiLevelType w:val="hybridMultilevel"/>
     <w:tmpl w:val="3564B2D2"/>
@@ -13443,7 +13443,7 @@
       </w:pPr>
     </w:lvl>
   </w:abstractNum>
-  <w:abstractNum w:abstractNumId="9" w15:restartNumberingAfterBreak="0">
+  <w:abstractNum w:abstractNumId="9">
     <w:nsid w:val="74A2298E"/>
     <w:multiLevelType w:val="hybridMultilevel"/>
     <w:tmpl w:val="79A64A68"/>
@@ -13566,7 +13566,7 @@
 </file>
 
 <file path=word/styles.xml><?xml version="1.0" encoding="utf-8"?>
-<w:styles xmlns:mc="http://schemas.openxmlformats.org/markup-compatibility/2006" xmlns:r="http://schemas.openxmlformats.org/officeDocument/2006/relationships" xmlns:w="http://schemas.openxmlformats.org/wordprocessingml/2006/main" xmlns:w14="http://schemas.microsoft.com/office/word/2010/wordml" xmlns:w15="http://schemas.microsoft.com/office/word/2012/wordml" xmlns:w16cex="http://schemas.microsoft.com/office/word/2018/wordml/cex" xmlns:w16cid="http://schemas.microsoft.com/office/word/2016/wordml/cid" xmlns:w16="http://schemas.microsoft.com/office/word/2018/wordml" xmlns:w16sdtdh="http://schemas.microsoft.com/office/word/2020/wordml/sdtdatahash" xmlns:w16se="http://schemas.microsoft.com/office/word/2015/wordml/symex" mc:Ignorable="w14 w15 w16se w16cid w16 w16cex w16sdtdh">
+<w:styles xmlns:mc="http://schemas.openxmlformats.org/markup-compatibility/2006" xmlns:r="http://schemas.openxmlformats.org/officeDocument/2006/relationships" xmlns:w="http://schemas.openxmlformats.org/wordprocessingml/2006/main" xmlns:w14="http://schemas.microsoft.com/office/word/2010/wordml" xmlns:w15="http://schemas.microsoft.com/office/word/2012/wordml" xmlns:w16cex="http://schemas.microsoft.com/office/word/2018/wordml/cex" xmlns:w16="http://schemas.microsoft.com/office/word/2018/wordml" xmlns:w16sdtdh="http://schemas.microsoft.com/office/word/2020/wordml/sdtdatahash" xmlns:w16se="http://schemas.microsoft.com/office/word/2015/wordml/symex">
   <w:docDefaults>
     <w:rPrDefault>
       <w:rPr>

</xml_diff>

<commit_message>
fix: harden skill runtime assets and validation
Consolidate runtime asset repairs, eval coverage, final validation, governance safeguards, routing cleanup, and audit documentation.
</commit_message>
<xml_diff>
--- a/skills/phong-cntt/assets/bbnt-khoi-luong-hoan-thanh.docx
+++ b/skills/phong-cntt/assets/bbnt-khoi-luong-hoan-thanh.docx
@@ -1,6 +1,6 @@
 
 <file path=word/document.xml><?xml version="1.0" encoding="utf-8"?>
-<w:document xmlns:ns1="http://schemas.openxmlformats.org/markup-compatibility/2006" xmlns:ns2="http://schemas.microsoft.com/office/word/2010/wordml" xmlns:ns3="http://schemas.openxmlformats.org/officeDocument/2006/relationships" xmlns:w="http://schemas.openxmlformats.org/wordprocessingml/2006/main" ns1:Ignorable="w14 w15 w16se w16cid w16 w16cex w16sdtdh wp14">
+<w:document xmlns:ns1="http://schemas.openxmlformats.org/markup-compatibility/2006" xmlns:ns2="http://schemas.microsoft.com/office/word/2010/wordml" xmlns:ns3="http://schemas.openxmlformats.org/officeDocument/2006/relationships" xmlns:w="http://schemas.openxmlformats.org/wordprocessingml/2006/main">
   <w:body>
     <w:p ns2:paraId="7E6EF765" ns2:textId="77777777">
       <w:pPr>
@@ -12391,7 +12391,7 @@
 </file>
 
 <file path=word/endnotes.xml><?xml version="1.0" encoding="utf-8"?>
-<w:endnotes xmlns:wpc="http://schemas.microsoft.com/office/word/2010/wordprocessingCanvas" xmlns:cx="http://schemas.microsoft.com/office/drawing/2014/chartex" xmlns:cx1="http://schemas.microsoft.com/office/drawing/2015/9/8/chartex" xmlns:cx2="http://schemas.microsoft.com/office/drawing/2015/10/21/chartex" xmlns:cx3="http://schemas.microsoft.com/office/drawing/2016/5/9/chartex" xmlns:cx4="http://schemas.microsoft.com/office/drawing/2016/5/10/chartex" xmlns:cx5="http://schemas.microsoft.com/office/drawing/2016/5/11/chartex" xmlns:cx6="http://schemas.microsoft.com/office/drawing/2016/5/12/chartex" xmlns:cx7="http://schemas.microsoft.com/office/drawing/2016/5/13/chartex" xmlns:cx8="http://schemas.microsoft.com/office/drawing/2016/5/14/chartex" xmlns:mc="http://schemas.openxmlformats.org/markup-compatibility/2006" xmlns:aink="http://schemas.microsoft.com/office/drawing/2016/ink" xmlns:am3d="http://schemas.microsoft.com/office/drawing/2017/model3d" xmlns:o="urn:schemas-microsoft-com:office:office" xmlns:r="http://schemas.openxmlformats.org/officeDocument/2006/relationships" xmlns:m="http://schemas.openxmlformats.org/officeDocument/2006/math" xmlns:v="urn:schemas-microsoft-com:vml" xmlns:wp14="http://schemas.microsoft.com/office/word/2010/wordprocessingDrawing" xmlns:wp="http://schemas.openxmlformats.org/drawingml/2006/wordprocessingDrawing" xmlns:w10="urn:schemas-microsoft-com:office:word" xmlns:w="http://schemas.openxmlformats.org/wordprocessingml/2006/main" xmlns:w14="http://schemas.microsoft.com/office/word/2010/wordml" xmlns:w15="http://schemas.microsoft.com/office/word/2012/wordml" xmlns:w16cex="http://schemas.microsoft.com/office/word/2018/wordml/cex" xmlns:w16cid="http://schemas.microsoft.com/office/word/2016/wordml/cid" xmlns:w16="http://schemas.microsoft.com/office/word/2018/wordml" xmlns:w16sdtdh="http://schemas.microsoft.com/office/word/2020/wordml/sdtdatahash" xmlns:w16se="http://schemas.microsoft.com/office/word/2015/wordml/symex" xmlns:wpg="http://schemas.microsoft.com/office/word/2010/wordprocessingGroup" xmlns:wpi="http://schemas.microsoft.com/office/word/2010/wordprocessingInk" xmlns:wne="http://schemas.microsoft.com/office/word/2006/wordml" xmlns:wps="http://schemas.microsoft.com/office/word/2010/wordprocessingShape" mc:Ignorable="w14 w15 w16se w16cid w16 w16cex w16sdtdh wp14">
+<w:endnotes xmlns:wpc="http://schemas.microsoft.com/office/word/2010/wordprocessingCanvas" xmlns:cx="http://schemas.microsoft.com/office/drawing/2014/chartex" xmlns:cx1="http://schemas.microsoft.com/office/drawing/2015/9/8/chartex" xmlns:cx2="http://schemas.microsoft.com/office/drawing/2015/10/21/chartex" xmlns:cx3="http://schemas.microsoft.com/office/drawing/2016/5/9/chartex" xmlns:cx4="http://schemas.microsoft.com/office/drawing/2016/5/10/chartex" xmlns:cx5="http://schemas.microsoft.com/office/drawing/2016/5/11/chartex" xmlns:cx6="http://schemas.microsoft.com/office/drawing/2016/5/12/chartex" xmlns:cx7="http://schemas.microsoft.com/office/drawing/2016/5/13/chartex" xmlns:cx8="http://schemas.microsoft.com/office/drawing/2016/5/14/chartex" xmlns:mc="http://schemas.openxmlformats.org/markup-compatibility/2006" xmlns:aink="http://schemas.microsoft.com/office/drawing/2016/ink" xmlns:am3d="http://schemas.microsoft.com/office/drawing/2017/model3d" xmlns:o="urn:schemas-microsoft-com:office:office" xmlns:r="http://schemas.openxmlformats.org/officeDocument/2006/relationships" xmlns:m="http://schemas.openxmlformats.org/officeDocument/2006/math" xmlns:v="urn:schemas-microsoft-com:vml" xmlns:wp14="http://schemas.microsoft.com/office/word/2010/wordprocessingDrawing" xmlns:wp="http://schemas.openxmlformats.org/drawingml/2006/wordprocessingDrawing" xmlns:w10="urn:schemas-microsoft-com:office:word" xmlns:w="http://schemas.openxmlformats.org/wordprocessingml/2006/main" xmlns:w14="http://schemas.microsoft.com/office/word/2010/wordml" xmlns:w15="http://schemas.microsoft.com/office/word/2012/wordml" xmlns:w16cex="http://schemas.microsoft.com/office/word/2018/wordml/cex" xmlns:w16="http://schemas.microsoft.com/office/word/2018/wordml" xmlns:w16sdtdh="http://schemas.microsoft.com/office/word/2020/wordml/sdtdatahash" xmlns:w16se="http://schemas.microsoft.com/office/word/2015/wordml/symex" xmlns:wpg="http://schemas.microsoft.com/office/word/2010/wordprocessingGroup" xmlns:wpi="http://schemas.microsoft.com/office/word/2010/wordprocessingInk" xmlns:wne="http://schemas.microsoft.com/office/word/2006/wordml" xmlns:wps="http://schemas.microsoft.com/office/word/2010/wordprocessingShape">
   <w:endnote w:type="separator" w:id="-1">
     <w:p>
       <w:r>
@@ -12410,7 +12410,7 @@
 </file>
 
 <file path=word/footer1.xml><?xml version="1.0" encoding="utf-8"?>
-<w:ftr xmlns:wpc="http://schemas.microsoft.com/office/word/2010/wordprocessingCanvas" xmlns:cx="http://schemas.microsoft.com/office/drawing/2014/chartex" xmlns:cx1="http://schemas.microsoft.com/office/drawing/2015/9/8/chartex" xmlns:cx2="http://schemas.microsoft.com/office/drawing/2015/10/21/chartex" xmlns:cx3="http://schemas.microsoft.com/office/drawing/2016/5/9/chartex" xmlns:cx4="http://schemas.microsoft.com/office/drawing/2016/5/10/chartex" xmlns:cx5="http://schemas.microsoft.com/office/drawing/2016/5/11/chartex" xmlns:cx6="http://schemas.microsoft.com/office/drawing/2016/5/12/chartex" xmlns:cx7="http://schemas.microsoft.com/office/drawing/2016/5/13/chartex" xmlns:cx8="http://schemas.microsoft.com/office/drawing/2016/5/14/chartex" xmlns:mc="http://schemas.openxmlformats.org/markup-compatibility/2006" xmlns:aink="http://schemas.microsoft.com/office/drawing/2016/ink" xmlns:am3d="http://schemas.microsoft.com/office/drawing/2017/model3d" xmlns:o="urn:schemas-microsoft-com:office:office" xmlns:r="http://schemas.openxmlformats.org/officeDocument/2006/relationships" xmlns:m="http://schemas.openxmlformats.org/officeDocument/2006/math" xmlns:v="urn:schemas-microsoft-com:vml" xmlns:wp14="http://schemas.microsoft.com/office/word/2010/wordprocessingDrawing" xmlns:wp="http://schemas.openxmlformats.org/drawingml/2006/wordprocessingDrawing" xmlns:w10="urn:schemas-microsoft-com:office:word" xmlns:w="http://schemas.openxmlformats.org/wordprocessingml/2006/main" xmlns:w14="http://schemas.microsoft.com/office/word/2010/wordml" xmlns:w15="http://schemas.microsoft.com/office/word/2012/wordml" xmlns:w16cex="http://schemas.microsoft.com/office/word/2018/wordml/cex" xmlns:w16cid="http://schemas.microsoft.com/office/word/2016/wordml/cid" xmlns:w16="http://schemas.microsoft.com/office/word/2018/wordml" xmlns:w16sdtdh="http://schemas.microsoft.com/office/word/2020/wordml/sdtdatahash" xmlns:w16se="http://schemas.microsoft.com/office/word/2015/wordml/symex" xmlns:wpg="http://schemas.microsoft.com/office/word/2010/wordprocessingGroup" xmlns:wpi="http://schemas.microsoft.com/office/word/2010/wordprocessingInk" xmlns:wne="http://schemas.microsoft.com/office/word/2006/wordml" xmlns:wps="http://schemas.microsoft.com/office/word/2010/wordprocessingShape" mc:Ignorable="w14 w15 w16se w16cid w16 w16cex w16sdtdh wp14">
+<w:ftr xmlns:wpc="http://schemas.microsoft.com/office/word/2010/wordprocessingCanvas" xmlns:cx="http://schemas.microsoft.com/office/drawing/2014/chartex" xmlns:cx1="http://schemas.microsoft.com/office/drawing/2015/9/8/chartex" xmlns:cx2="http://schemas.microsoft.com/office/drawing/2015/10/21/chartex" xmlns:cx3="http://schemas.microsoft.com/office/drawing/2016/5/9/chartex" xmlns:cx4="http://schemas.microsoft.com/office/drawing/2016/5/10/chartex" xmlns:cx5="http://schemas.microsoft.com/office/drawing/2016/5/11/chartex" xmlns:cx6="http://schemas.microsoft.com/office/drawing/2016/5/12/chartex" xmlns:cx7="http://schemas.microsoft.com/office/drawing/2016/5/13/chartex" xmlns:cx8="http://schemas.microsoft.com/office/drawing/2016/5/14/chartex" xmlns:mc="http://schemas.openxmlformats.org/markup-compatibility/2006" xmlns:aink="http://schemas.microsoft.com/office/drawing/2016/ink" xmlns:am3d="http://schemas.microsoft.com/office/drawing/2017/model3d" xmlns:o="urn:schemas-microsoft-com:office:office" xmlns:r="http://schemas.openxmlformats.org/officeDocument/2006/relationships" xmlns:m="http://schemas.openxmlformats.org/officeDocument/2006/math" xmlns:v="urn:schemas-microsoft-com:vml" xmlns:wp14="http://schemas.microsoft.com/office/word/2010/wordprocessingDrawing" xmlns:wp="http://schemas.openxmlformats.org/drawingml/2006/wordprocessingDrawing" xmlns:w10="urn:schemas-microsoft-com:office:word" xmlns:w="http://schemas.openxmlformats.org/wordprocessingml/2006/main" xmlns:w14="http://schemas.microsoft.com/office/word/2010/wordml" xmlns:w15="http://schemas.microsoft.com/office/word/2012/wordml" xmlns:w16cex="http://schemas.microsoft.com/office/word/2018/wordml/cex" xmlns:w16="http://schemas.microsoft.com/office/word/2018/wordml" xmlns:w16sdtdh="http://schemas.microsoft.com/office/word/2020/wordml/sdtdatahash" xmlns:w16se="http://schemas.microsoft.com/office/word/2015/wordml/symex" xmlns:wpg="http://schemas.microsoft.com/office/word/2010/wordprocessingGroup" xmlns:wpi="http://schemas.microsoft.com/office/word/2010/wordprocessingInk" xmlns:wne="http://schemas.microsoft.com/office/word/2006/wordml" xmlns:wps="http://schemas.microsoft.com/office/word/2010/wordprocessingShape">
   <w:p>
     <w:pPr>
       <w:pStyle w:val="Footer"/>
@@ -12420,7 +12420,7 @@
 </file>
 
 <file path=word/footnotes.xml><?xml version="1.0" encoding="utf-8"?>
-<w:footnotes xmlns:wpc="http://schemas.microsoft.com/office/word/2010/wordprocessingCanvas" xmlns:cx="http://schemas.microsoft.com/office/drawing/2014/chartex" xmlns:cx1="http://schemas.microsoft.com/office/drawing/2015/9/8/chartex" xmlns:cx2="http://schemas.microsoft.com/office/drawing/2015/10/21/chartex" xmlns:cx3="http://schemas.microsoft.com/office/drawing/2016/5/9/chartex" xmlns:cx4="http://schemas.microsoft.com/office/drawing/2016/5/10/chartex" xmlns:cx5="http://schemas.microsoft.com/office/drawing/2016/5/11/chartex" xmlns:cx6="http://schemas.microsoft.com/office/drawing/2016/5/12/chartex" xmlns:cx7="http://schemas.microsoft.com/office/drawing/2016/5/13/chartex" xmlns:cx8="http://schemas.microsoft.com/office/drawing/2016/5/14/chartex" xmlns:mc="http://schemas.openxmlformats.org/markup-compatibility/2006" xmlns:aink="http://schemas.microsoft.com/office/drawing/2016/ink" xmlns:am3d="http://schemas.microsoft.com/office/drawing/2017/model3d" xmlns:o="urn:schemas-microsoft-com:office:office" xmlns:r="http://schemas.openxmlformats.org/officeDocument/2006/relationships" xmlns:m="http://schemas.openxmlformats.org/officeDocument/2006/math" xmlns:v="urn:schemas-microsoft-com:vml" xmlns:wp14="http://schemas.microsoft.com/office/word/2010/wordprocessingDrawing" xmlns:wp="http://schemas.openxmlformats.org/drawingml/2006/wordprocessingDrawing" xmlns:w10="urn:schemas-microsoft-com:office:word" xmlns:w="http://schemas.openxmlformats.org/wordprocessingml/2006/main" xmlns:w14="http://schemas.microsoft.com/office/word/2010/wordml" xmlns:w15="http://schemas.microsoft.com/office/word/2012/wordml" xmlns:w16cex="http://schemas.microsoft.com/office/word/2018/wordml/cex" xmlns:w16cid="http://schemas.microsoft.com/office/word/2016/wordml/cid" xmlns:w16="http://schemas.microsoft.com/office/word/2018/wordml" xmlns:w16sdtdh="http://schemas.microsoft.com/office/word/2020/wordml/sdtdatahash" xmlns:w16se="http://schemas.microsoft.com/office/word/2015/wordml/symex" xmlns:wpg="http://schemas.microsoft.com/office/word/2010/wordprocessingGroup" xmlns:wpi="http://schemas.microsoft.com/office/word/2010/wordprocessingInk" xmlns:wne="http://schemas.microsoft.com/office/word/2006/wordml" xmlns:wps="http://schemas.microsoft.com/office/word/2010/wordprocessingShape" mc:Ignorable="w14 w15 w16se w16cid w16 w16cex w16sdtdh wp14">
+<w:footnotes xmlns:wpc="http://schemas.microsoft.com/office/word/2010/wordprocessingCanvas" xmlns:cx="http://schemas.microsoft.com/office/drawing/2014/chartex" xmlns:cx1="http://schemas.microsoft.com/office/drawing/2015/9/8/chartex" xmlns:cx2="http://schemas.microsoft.com/office/drawing/2015/10/21/chartex" xmlns:cx3="http://schemas.microsoft.com/office/drawing/2016/5/9/chartex" xmlns:cx4="http://schemas.microsoft.com/office/drawing/2016/5/10/chartex" xmlns:cx5="http://schemas.microsoft.com/office/drawing/2016/5/11/chartex" xmlns:cx6="http://schemas.microsoft.com/office/drawing/2016/5/12/chartex" xmlns:cx7="http://schemas.microsoft.com/office/drawing/2016/5/13/chartex" xmlns:cx8="http://schemas.microsoft.com/office/drawing/2016/5/14/chartex" xmlns:mc="http://schemas.openxmlformats.org/markup-compatibility/2006" xmlns:aink="http://schemas.microsoft.com/office/drawing/2016/ink" xmlns:am3d="http://schemas.microsoft.com/office/drawing/2017/model3d" xmlns:o="urn:schemas-microsoft-com:office:office" xmlns:r="http://schemas.openxmlformats.org/officeDocument/2006/relationships" xmlns:m="http://schemas.openxmlformats.org/officeDocument/2006/math" xmlns:v="urn:schemas-microsoft-com:vml" xmlns:wp14="http://schemas.microsoft.com/office/word/2010/wordprocessingDrawing" xmlns:wp="http://schemas.openxmlformats.org/drawingml/2006/wordprocessingDrawing" xmlns:w10="urn:schemas-microsoft-com:office:word" xmlns:w="http://schemas.openxmlformats.org/wordprocessingml/2006/main" xmlns:w14="http://schemas.microsoft.com/office/word/2010/wordml" xmlns:w15="http://schemas.microsoft.com/office/word/2012/wordml" xmlns:w16cex="http://schemas.microsoft.com/office/word/2018/wordml/cex" xmlns:w16="http://schemas.microsoft.com/office/word/2018/wordml" xmlns:w16sdtdh="http://schemas.microsoft.com/office/word/2020/wordml/sdtdatahash" xmlns:w16se="http://schemas.microsoft.com/office/word/2015/wordml/symex" xmlns:wpg="http://schemas.microsoft.com/office/word/2010/wordprocessingGroup" xmlns:wpi="http://schemas.microsoft.com/office/word/2010/wordprocessingInk" xmlns:wne="http://schemas.microsoft.com/office/word/2006/wordml" xmlns:wps="http://schemas.microsoft.com/office/word/2010/wordprocessingShape">
   <w:footnote w:type="separator" w:id="-1">
     <w:p>
       <w:r>
@@ -12439,8 +12439,8 @@
 </file>
 
 <file path=word/numbering.xml><?xml version="1.0" encoding="utf-8"?>
-<w:numbering xmlns:wpc="http://schemas.microsoft.com/office/word/2010/wordprocessingCanvas" xmlns:cx="http://schemas.microsoft.com/office/drawing/2014/chartex" xmlns:cx1="http://schemas.microsoft.com/office/drawing/2015/9/8/chartex" xmlns:cx2="http://schemas.microsoft.com/office/drawing/2015/10/21/chartex" xmlns:cx3="http://schemas.microsoft.com/office/drawing/2016/5/9/chartex" xmlns:cx4="http://schemas.microsoft.com/office/drawing/2016/5/10/chartex" xmlns:cx5="http://schemas.microsoft.com/office/drawing/2016/5/11/chartex" xmlns:cx6="http://schemas.microsoft.com/office/drawing/2016/5/12/chartex" xmlns:cx7="http://schemas.microsoft.com/office/drawing/2016/5/13/chartex" xmlns:cx8="http://schemas.microsoft.com/office/drawing/2016/5/14/chartex" xmlns:mc="http://schemas.openxmlformats.org/markup-compatibility/2006" xmlns:aink="http://schemas.microsoft.com/office/drawing/2016/ink" xmlns:am3d="http://schemas.microsoft.com/office/drawing/2017/model3d" xmlns:o="urn:schemas-microsoft-com:office:office" xmlns:r="http://schemas.openxmlformats.org/officeDocument/2006/relationships" xmlns:m="http://schemas.openxmlformats.org/officeDocument/2006/math" xmlns:v="urn:schemas-microsoft-com:vml" xmlns:wp14="http://schemas.microsoft.com/office/word/2010/wordprocessingDrawing" xmlns:wp="http://schemas.openxmlformats.org/drawingml/2006/wordprocessingDrawing" xmlns:w10="urn:schemas-microsoft-com:office:word" xmlns:w="http://schemas.openxmlformats.org/wordprocessingml/2006/main" xmlns:w14="http://schemas.microsoft.com/office/word/2010/wordml" xmlns:w15="http://schemas.microsoft.com/office/word/2012/wordml" xmlns:w16cex="http://schemas.microsoft.com/office/word/2018/wordml/cex" xmlns:w16cid="http://schemas.microsoft.com/office/word/2016/wordml/cid" xmlns:w16="http://schemas.microsoft.com/office/word/2018/wordml" xmlns:w16sdtdh="http://schemas.microsoft.com/office/word/2020/wordml/sdtdatahash" xmlns:w16se="http://schemas.microsoft.com/office/word/2015/wordml/symex" xmlns:wpg="http://schemas.microsoft.com/office/word/2010/wordprocessingGroup" xmlns:wpi="http://schemas.microsoft.com/office/word/2010/wordprocessingInk" xmlns:wne="http://schemas.microsoft.com/office/word/2006/wordml" xmlns:wps="http://schemas.microsoft.com/office/word/2010/wordprocessingShape" mc:Ignorable="w14 w15 w16se w16cid w16 w16cex w16sdtdh wp14">
-  <w:abstractNum w:abstractNumId="0" w15:restartNumberingAfterBreak="0">
+<w:numbering xmlns:wpc="http://schemas.microsoft.com/office/word/2010/wordprocessingCanvas" xmlns:cx="http://schemas.microsoft.com/office/drawing/2014/chartex" xmlns:cx1="http://schemas.microsoft.com/office/drawing/2015/9/8/chartex" xmlns:cx2="http://schemas.microsoft.com/office/drawing/2015/10/21/chartex" xmlns:cx3="http://schemas.microsoft.com/office/drawing/2016/5/9/chartex" xmlns:cx4="http://schemas.microsoft.com/office/drawing/2016/5/10/chartex" xmlns:cx5="http://schemas.microsoft.com/office/drawing/2016/5/11/chartex" xmlns:cx6="http://schemas.microsoft.com/office/drawing/2016/5/12/chartex" xmlns:cx7="http://schemas.microsoft.com/office/drawing/2016/5/13/chartex" xmlns:cx8="http://schemas.microsoft.com/office/drawing/2016/5/14/chartex" xmlns:mc="http://schemas.openxmlformats.org/markup-compatibility/2006" xmlns:aink="http://schemas.microsoft.com/office/drawing/2016/ink" xmlns:am3d="http://schemas.microsoft.com/office/drawing/2017/model3d" xmlns:o="urn:schemas-microsoft-com:office:office" xmlns:r="http://schemas.openxmlformats.org/officeDocument/2006/relationships" xmlns:m="http://schemas.openxmlformats.org/officeDocument/2006/math" xmlns:v="urn:schemas-microsoft-com:vml" xmlns:wp14="http://schemas.microsoft.com/office/word/2010/wordprocessingDrawing" xmlns:wp="http://schemas.openxmlformats.org/drawingml/2006/wordprocessingDrawing" xmlns:w10="urn:schemas-microsoft-com:office:word" xmlns:w="http://schemas.openxmlformats.org/wordprocessingml/2006/main" xmlns:w14="http://schemas.microsoft.com/office/word/2010/wordml" xmlns:w15="http://schemas.microsoft.com/office/word/2012/wordml" xmlns:w16cex="http://schemas.microsoft.com/office/word/2018/wordml/cex" xmlns:w16="http://schemas.microsoft.com/office/word/2018/wordml" xmlns:w16sdtdh="http://schemas.microsoft.com/office/word/2020/wordml/sdtdatahash" xmlns:w16se="http://schemas.microsoft.com/office/word/2015/wordml/symex" xmlns:wpg="http://schemas.microsoft.com/office/word/2010/wordprocessingGroup" xmlns:wpi="http://schemas.microsoft.com/office/word/2010/wordprocessingInk" xmlns:wne="http://schemas.microsoft.com/office/word/2006/wordml" xmlns:wps="http://schemas.microsoft.com/office/word/2010/wordprocessingShape">
+  <w:abstractNum w:abstractNumId="0">
     <w:nsid w:val="09842C46"/>
     <w:multiLevelType w:val="hybridMultilevel"/>
     <w:tmpl w:val="BD945E98"/>
@@ -12556,7 +12556,7 @@
       </w:pPr>
     </w:lvl>
   </w:abstractNum>
-  <w:abstractNum w:abstractNumId="1" w15:restartNumberingAfterBreak="0">
+  <w:abstractNum w:abstractNumId="1">
     <w:nsid w:val="1C867597"/>
     <w:multiLevelType w:val="hybridMultilevel"/>
     <w:tmpl w:val="D68E88BE"/>
@@ -12670,7 +12670,7 @@
       </w:rPr>
     </w:lvl>
   </w:abstractNum>
-  <w:abstractNum w:abstractNumId="2" w15:restartNumberingAfterBreak="0">
+  <w:abstractNum w:abstractNumId="2">
     <w:nsid w:val="20D24CD7"/>
     <w:multiLevelType w:val="hybridMultilevel"/>
     <w:tmpl w:val="41C6B320"/>
@@ -12783,7 +12783,7 @@
       </w:rPr>
     </w:lvl>
   </w:abstractNum>
-  <w:abstractNum w:abstractNumId="3" w15:restartNumberingAfterBreak="0">
+  <w:abstractNum w:abstractNumId="3">
     <w:nsid w:val="26484061"/>
     <w:multiLevelType w:val="hybridMultilevel"/>
     <w:tmpl w:val="2278AE5C"/>
@@ -12873,7 +12873,7 @@
       </w:pPr>
     </w:lvl>
   </w:abstractNum>
-  <w:abstractNum w:abstractNumId="4" w15:restartNumberingAfterBreak="0">
+  <w:abstractNum w:abstractNumId="4">
     <w:nsid w:val="304B68A4"/>
     <w:multiLevelType w:val="hybridMultilevel"/>
     <w:tmpl w:val="FE1075E8"/>
@@ -13012,7 +13012,7 @@
       </w:rPr>
     </w:lvl>
   </w:abstractNum>
-  <w:abstractNum w:abstractNumId="5" w15:restartNumberingAfterBreak="0">
+  <w:abstractNum w:abstractNumId="5">
     <w:nsid w:val="3EBE4479"/>
     <w:multiLevelType w:val="hybridMultilevel"/>
     <w:tmpl w:val="EFE01DEE"/>
@@ -13102,7 +13102,7 @@
       </w:pPr>
     </w:lvl>
   </w:abstractNum>
-  <w:abstractNum w:abstractNumId="6" w15:restartNumberingAfterBreak="0">
+  <w:abstractNum w:abstractNumId="6">
     <w:nsid w:val="5E524890"/>
     <w:multiLevelType w:val="multilevel"/>
     <w:tmpl w:val="FE1075E8"/>
@@ -13241,7 +13241,7 @@
       </w:rPr>
     </w:lvl>
   </w:abstractNum>
-  <w:abstractNum w:abstractNumId="7" w15:restartNumberingAfterBreak="0">
+  <w:abstractNum w:abstractNumId="7">
     <w:nsid w:val="5FBF77DE"/>
     <w:multiLevelType w:val="hybridMultilevel"/>
     <w:tmpl w:val="1F0EA556"/>
@@ -13357,7 +13357,7 @@
       </w:pPr>
     </w:lvl>
   </w:abstractNum>
-  <w:abstractNum w:abstractNumId="8" w15:restartNumberingAfterBreak="0">
+  <w:abstractNum w:abstractNumId="8">
     <w:nsid w:val="64236AAA"/>
     <w:multiLevelType w:val="hybridMultilevel"/>
     <w:tmpl w:val="3564B2D2"/>
@@ -13443,7 +13443,7 @@
       </w:pPr>
     </w:lvl>
   </w:abstractNum>
-  <w:abstractNum w:abstractNumId="9" w15:restartNumberingAfterBreak="0">
+  <w:abstractNum w:abstractNumId="9">
     <w:nsid w:val="74A2298E"/>
     <w:multiLevelType w:val="hybridMultilevel"/>
     <w:tmpl w:val="79A64A68"/>
@@ -13566,7 +13566,7 @@
 </file>
 
 <file path=word/styles.xml><?xml version="1.0" encoding="utf-8"?>
-<w:styles xmlns:mc="http://schemas.openxmlformats.org/markup-compatibility/2006" xmlns:r="http://schemas.openxmlformats.org/officeDocument/2006/relationships" xmlns:w="http://schemas.openxmlformats.org/wordprocessingml/2006/main" xmlns:w14="http://schemas.microsoft.com/office/word/2010/wordml" xmlns:w15="http://schemas.microsoft.com/office/word/2012/wordml" xmlns:w16cex="http://schemas.microsoft.com/office/word/2018/wordml/cex" xmlns:w16cid="http://schemas.microsoft.com/office/word/2016/wordml/cid" xmlns:w16="http://schemas.microsoft.com/office/word/2018/wordml" xmlns:w16sdtdh="http://schemas.microsoft.com/office/word/2020/wordml/sdtdatahash" xmlns:w16se="http://schemas.microsoft.com/office/word/2015/wordml/symex" mc:Ignorable="w14 w15 w16se w16cid w16 w16cex w16sdtdh">
+<w:styles xmlns:mc="http://schemas.openxmlformats.org/markup-compatibility/2006" xmlns:r="http://schemas.openxmlformats.org/officeDocument/2006/relationships" xmlns:w="http://schemas.openxmlformats.org/wordprocessingml/2006/main" xmlns:w14="http://schemas.microsoft.com/office/word/2010/wordml" xmlns:w15="http://schemas.microsoft.com/office/word/2012/wordml" xmlns:w16cex="http://schemas.microsoft.com/office/word/2018/wordml/cex" xmlns:w16="http://schemas.microsoft.com/office/word/2018/wordml" xmlns:w16sdtdh="http://schemas.microsoft.com/office/word/2020/wordml/sdtdatahash" xmlns:w16se="http://schemas.microsoft.com/office/word/2015/wordml/symex">
   <w:docDefaults>
     <w:rPrDefault>
       <w:rPr>

</xml_diff>

<commit_message>
fix: cross-platform tar-based zip/unzip + setup.ps1 SkillOnly mode
- Replace Expand-Archive/Compress-Archive (PowerShell) with tar -xf/tar -cf
  in normalize-runtime-assets.js and build-runtime-assets.js. PowerShell
  rejects .docx extension; tar handles ZIP format without caring about
  extension name. Fixes Windows build/normalize pipeline.
- Add safeRmSync with retry logic for Windows file-lock EPERM errors
  (antivirus/git holding file handles during rename operations).
- Add -SkillOnly flag to setup.ps1: skips tooling install [1/8]-[6/8],
  installs only officecli + one department skill via npx skills add.
  Workaround for OpenWork cloud syncing all 12 skills to every org member.
- Re-normalize all 89 runtime DOCX assets (tar produces smaller archives).
</commit_message>
<xml_diff>
--- a/skills/phong-cntt/assets/bbnt-khoi-luong-hoan-thanh.docx
+++ b/skills/phong-cntt/assets/bbnt-khoi-luong-hoan-thanh.docx
@@ -1,5 +1,72 @@
 
-<file path=word/document.xml><?xml version="1.0" encoding="utf-8"?>
+<file path=./[Content_Types].xml><?xml version="1.0" encoding="utf-8"?>
+<Types xmlns="http://schemas.openxmlformats.org/package/2006/content-types">
+  <Default Extension="rels" ContentType="application/vnd.openxmlformats-package.relationships+xml"/>
+  <Default Extension="xml" ContentType="application/xml"/>
+  <Override PartName="/word/document.xml" ContentType="application/vnd.openxmlformats-officedocument.wordprocessingml.document.main+xml"/>
+  <Override PartName="/word/numbering.xml" ContentType="application/vnd.openxmlformats-officedocument.wordprocessingml.numbering+xml"/>
+  <Override PartName="/word/styles.xml" ContentType="application/vnd.openxmlformats-officedocument.wordprocessingml.styles+xml"/>
+  <Override PartName="/word/settings.xml" ContentType="application/vnd.openxmlformats-officedocument.wordprocessingml.settings+xml"/>
+  <Override PartName="/word/webSettings.xml" ContentType="application/vnd.openxmlformats-officedocument.wordprocessingml.webSettings+xml"/>
+  <Override PartName="/word/footnotes.xml" ContentType="application/vnd.openxmlformats-officedocument.wordprocessingml.footnotes+xml"/>
+  <Override PartName="/word/endnotes.xml" ContentType="application/vnd.openxmlformats-officedocument.wordprocessingml.endnotes+xml"/>
+  <Override PartName="/word/footer1.xml" ContentType="application/vnd.openxmlformats-officedocument.wordprocessingml.footer+xml"/>
+  <Override PartName="/word/fontTable.xml" ContentType="application/vnd.openxmlformats-officedocument.wordprocessingml.fontTable+xml"/>
+  <Override PartName="/word/theme/theme1.xml" ContentType="application/vnd.openxmlformats-officedocument.theme+xml"/>
+  <Override PartName="/docProps/core.xml" ContentType="application/vnd.openxmlformats-package.core-properties+xml"/>
+  <Override PartName="/docProps/app.xml" ContentType="application/vnd.openxmlformats-officedocument.extended-properties+xml"/>
+</Types>
+</file>
+
+<file path=./docProps/app.xml><?xml version="1.0" encoding="utf-8"?>
+<Properties xmlns="http://schemas.openxmlformats.org/officeDocument/2006/extended-properties" xmlns:vt="http://schemas.openxmlformats.org/officeDocument/2006/docPropsVTypes">
+  <Template>Normal</Template>
+  <TotalTime>3</TotalTime>
+  <Pages>9</Pages>
+  <Words>2262</Words>
+  <Characters>12895</Characters>
+  <Application>Microsoft Office Word</Application>
+  <DocSecurity>0</DocSecurity>
+  <Lines>107</Lines>
+  <Paragraphs>30</Paragraphs>
+  <ScaleCrop>false</ScaleCrop>
+  <HeadingPairs>
+    <vt:vector size="2" baseType="variant">
+      <vt:variant>
+        <vt:lpstr>Title</vt:lpstr>
+      </vt:variant>
+      <vt:variant>
+        <vt:i4>1</vt:i4>
+      </vt:variant>
+    </vt:vector>
+  </HeadingPairs>
+  <TitlesOfParts>
+    <vt:vector size="1" baseType="lpstr">
+      <vt:lpstr>BỘ CHQS TỈNH PHÚ THỌ</vt:lpstr>
+    </vt:vector>
+  </TitlesOfParts>
+  <Company>HOME</Company>
+  <LinksUpToDate>false</LinksUpToDate>
+  <CharactersWithSpaces>15127</CharactersWithSpaces>
+  <SharedDoc>false</SharedDoc>
+  <HyperlinksChanged>false</HyperlinksChanged>
+  <AppVersion>16.0000</AppVersion>
+</Properties>
+</file>
+
+<file path=./docProps/core.xml><?xml version="1.0" encoding="utf-8"?>
+<cp:coreProperties xmlns:cp="http://schemas.openxmlformats.org/package/2006/metadata/core-properties" xmlns:dc="http://purl.org/dc/elements/1.1/" xmlns:dcterms="http://purl.org/dc/terms/" xmlns:dcmitype="http://purl.org/dc/dcmitype/" xmlns:xsi="http://www.w3.org/2001/XMLSchema-instance">
+  <dc:title>BỘ CHQS TỈNH PHÚ THỌ</dc:title>
+  <dc:creator>DAT12345</dc:creator>
+  <cp:lastModifiedBy>My PC</cp:lastModifiedBy>
+  <cp:revision>3</cp:revision>
+  <cp:lastPrinted>2026-04-14T07:57:00Z</cp:lastPrinted>
+  <dcterms:created xsi:type="dcterms:W3CDTF">2026-04-13T01:46:00Z</dcterms:created>
+  <dcterms:modified xsi:type="dcterms:W3CDTF">2026-04-14T07:57:00Z</dcterms:modified>
+</cp:coreProperties>
+</file>
+
+<file path=./word/document.xml><?xml version="1.0" encoding="utf-8"?>
 <w:document xmlns:ns1="http://schemas.openxmlformats.org/markup-compatibility/2006" xmlns:ns2="http://schemas.microsoft.com/office/word/2010/wordml" xmlns:ns3="http://schemas.openxmlformats.org/officeDocument/2006/relationships" xmlns:w="http://schemas.openxmlformats.org/wordprocessingml/2006/main">
   <w:body>
     <w:p ns2:paraId="7E6EF765" ns2:textId="77777777">
@@ -12390,7 +12457,7 @@
 </w:document>
 </file>
 
-<file path=word/endnotes.xml><?xml version="1.0" encoding="utf-8"?>
+<file path=./word/endnotes.xml><?xml version="1.0" encoding="utf-8"?>
 <w:endnotes xmlns:wpc="http://schemas.microsoft.com/office/word/2010/wordprocessingCanvas" xmlns:cx="http://schemas.microsoft.com/office/drawing/2014/chartex" xmlns:cx1="http://schemas.microsoft.com/office/drawing/2015/9/8/chartex" xmlns:cx2="http://schemas.microsoft.com/office/drawing/2015/10/21/chartex" xmlns:cx3="http://schemas.microsoft.com/office/drawing/2016/5/9/chartex" xmlns:cx4="http://schemas.microsoft.com/office/drawing/2016/5/10/chartex" xmlns:cx5="http://schemas.microsoft.com/office/drawing/2016/5/11/chartex" xmlns:cx6="http://schemas.microsoft.com/office/drawing/2016/5/12/chartex" xmlns:cx7="http://schemas.microsoft.com/office/drawing/2016/5/13/chartex" xmlns:cx8="http://schemas.microsoft.com/office/drawing/2016/5/14/chartex" xmlns:mc="http://schemas.openxmlformats.org/markup-compatibility/2006" xmlns:aink="http://schemas.microsoft.com/office/drawing/2016/ink" xmlns:am3d="http://schemas.microsoft.com/office/drawing/2017/model3d" xmlns:o="urn:schemas-microsoft-com:office:office" xmlns:r="http://schemas.openxmlformats.org/officeDocument/2006/relationships" xmlns:m="http://schemas.openxmlformats.org/officeDocument/2006/math" xmlns:v="urn:schemas-microsoft-com:vml" xmlns:wp14="http://schemas.microsoft.com/office/word/2010/wordprocessingDrawing" xmlns:wp="http://schemas.openxmlformats.org/drawingml/2006/wordprocessingDrawing" xmlns:w10="urn:schemas-microsoft-com:office:word" xmlns:w="http://schemas.openxmlformats.org/wordprocessingml/2006/main" xmlns:w14="http://schemas.microsoft.com/office/word/2010/wordml" xmlns:w15="http://schemas.microsoft.com/office/word/2012/wordml" xmlns:w16cex="http://schemas.microsoft.com/office/word/2018/wordml/cex" xmlns:w16="http://schemas.microsoft.com/office/word/2018/wordml" xmlns:w16sdtdh="http://schemas.microsoft.com/office/word/2020/wordml/sdtdatahash" xmlns:w16se="http://schemas.microsoft.com/office/word/2015/wordml/symex" xmlns:wpg="http://schemas.microsoft.com/office/word/2010/wordprocessingGroup" xmlns:wpi="http://schemas.microsoft.com/office/word/2010/wordprocessingInk" xmlns:wne="http://schemas.microsoft.com/office/word/2006/wordml" xmlns:wps="http://schemas.microsoft.com/office/word/2010/wordprocessingShape">
   <w:endnote w:type="separator" w:id="-1">
     <w:p>
@@ -12409,7 +12476,67 @@
 </w:endnotes>
 </file>
 
-<file path=word/footer1.xml><?xml version="1.0" encoding="utf-8"?>
+<file path=./word/fontTable.xml><?xml version="1.0" encoding="utf-8"?>
+<w:fonts xmlns:mc="http://schemas.openxmlformats.org/markup-compatibility/2006" xmlns:r="http://schemas.openxmlformats.org/officeDocument/2006/relationships" xmlns:w="http://schemas.openxmlformats.org/wordprocessingml/2006/main" xmlns:w14="http://schemas.microsoft.com/office/word/2010/wordml" xmlns:w15="http://schemas.microsoft.com/office/word/2012/wordml" xmlns:w16cex="http://schemas.microsoft.com/office/word/2018/wordml/cex" xmlns:w16="http://schemas.microsoft.com/office/word/2018/wordml" xmlns:w16sdtdh="http://schemas.microsoft.com/office/word/2020/wordml/sdtdatahash" xmlns:w16se="http://schemas.microsoft.com/office/word/2015/wordml/symex">
+  <w:font w:name="Times New Roman">
+    <w:panose1 w:val="02020603050405020304"/>
+    <w:family w:val="roman"/>
+    <w:pitch w:val="variable"/>
+    <w:sig w:usb0="E0002EFF" w:usb1="C000785B" w:usb2="00000009" w:usb3="00000000" w:csb0="000001FF" w:csb1="00000000"/>
+  </w:font>
+  <w:font w:name="Courier New">
+    <w:panose1 w:val="02070309020205020404"/>
+    <w:family w:val="modern"/>
+    <w:pitch w:val="fixed"/>
+    <w:sig w:usb0="E0002EFF" w:usb1="C0007843" w:usb2="00000009" w:usb3="00000000" w:csb0="000001FF" w:csb1="00000000"/>
+  </w:font>
+  <w:font w:name="Wingdings">
+    <w:panose1 w:val="05000000000000000000"/>
+    <w:family w:val="auto"/>
+    <w:pitch w:val="variable"/>
+    <w:sig w:usb0="00000000" w:usb1="10000000" w:usb2="00000000" w:usb3="00000000" w:csb0="80000000" w:csb1="00000000"/>
+  </w:font>
+  <w:font w:name="Symbol">
+    <w:panose1 w:val="05050102010706020507"/>
+    <w:family w:val="roman"/>
+    <w:pitch w:val="variable"/>
+    <w:sig w:usb0="00000000" w:usb1="10000000" w:usb2="00000000" w:usb3="00000000" w:csb0="80000000" w:csb1="00000000"/>
+  </w:font>
+  <w:font w:name=".VnTime">
+    <w:panose1 w:val="020B7200000000000000"/>
+    <w:family w:val="swiss"/>
+    <w:pitch w:val="variable"/>
+    <w:sig w:usb0="00000003" w:usb1="00000000" w:usb2="00000000" w:usb3="00000000" w:csb0="00000001" w:csb1="00000000"/>
+  </w:font>
+  <w:font w:name="Segoe UI">
+    <w:panose1 w:val="020B0502040204020203"/>
+    <w:family w:val="swiss"/>
+    <w:pitch w:val="variable"/>
+    <w:sig w:usb0="E4002EFF" w:usb1="C000E47F" w:usb2="00000009" w:usb3="00000000" w:csb0="000001FF" w:csb1="00000000"/>
+  </w:font>
+  <w:font w:name="Calibri">
+    <w:panose1 w:val="020F0502020204030204"/>
+    <w:family w:val="swiss"/>
+    <w:pitch w:val="variable"/>
+    <w:sig w:usb0="E4002EFF" w:usb1="C000247B" w:usb2="00000009" w:usb3="00000000" w:csb0="000001FF" w:csb1="00000000"/>
+  </w:font>
+  <w:font w:name="SimSun">
+    <w:altName w:val="宋体"/>
+    <w:panose1 w:val="02010600030101010101"/>
+    <w:family w:val="auto"/>
+    <w:pitch w:val="variable"/>
+    <w:sig w:usb0="00000003" w:usb1="288F0000" w:usb2="00000016" w:usb3="00000000" w:csb0="00040001" w:csb1="00000000"/>
+  </w:font>
+  <w:font w:name="Cambria">
+    <w:panose1 w:val="02040503050406030204"/>
+    <w:family w:val="roman"/>
+    <w:pitch w:val="variable"/>
+    <w:sig w:usb0="E00006FF" w:usb1="420024FF" w:usb2="02000000" w:usb3="00000000" w:csb0="0000019F" w:csb1="00000000"/>
+  </w:font>
+</w:fonts>
+</file>
+
+<file path=./word/footer1.xml><?xml version="1.0" encoding="utf-8"?>
 <w:ftr xmlns:wpc="http://schemas.microsoft.com/office/word/2010/wordprocessingCanvas" xmlns:cx="http://schemas.microsoft.com/office/drawing/2014/chartex" xmlns:cx1="http://schemas.microsoft.com/office/drawing/2015/9/8/chartex" xmlns:cx2="http://schemas.microsoft.com/office/drawing/2015/10/21/chartex" xmlns:cx3="http://schemas.microsoft.com/office/drawing/2016/5/9/chartex" xmlns:cx4="http://schemas.microsoft.com/office/drawing/2016/5/10/chartex" xmlns:cx5="http://schemas.microsoft.com/office/drawing/2016/5/11/chartex" xmlns:cx6="http://schemas.microsoft.com/office/drawing/2016/5/12/chartex" xmlns:cx7="http://schemas.microsoft.com/office/drawing/2016/5/13/chartex" xmlns:cx8="http://schemas.microsoft.com/office/drawing/2016/5/14/chartex" xmlns:mc="http://schemas.openxmlformats.org/markup-compatibility/2006" xmlns:aink="http://schemas.microsoft.com/office/drawing/2016/ink" xmlns:am3d="http://schemas.microsoft.com/office/drawing/2017/model3d" xmlns:o="urn:schemas-microsoft-com:office:office" xmlns:r="http://schemas.openxmlformats.org/officeDocument/2006/relationships" xmlns:m="http://schemas.openxmlformats.org/officeDocument/2006/math" xmlns:v="urn:schemas-microsoft-com:vml" xmlns:wp14="http://schemas.microsoft.com/office/word/2010/wordprocessingDrawing" xmlns:wp="http://schemas.openxmlformats.org/drawingml/2006/wordprocessingDrawing" xmlns:w10="urn:schemas-microsoft-com:office:word" xmlns:w="http://schemas.openxmlformats.org/wordprocessingml/2006/main" xmlns:w14="http://schemas.microsoft.com/office/word/2010/wordml" xmlns:w15="http://schemas.microsoft.com/office/word/2012/wordml" xmlns:w16cex="http://schemas.microsoft.com/office/word/2018/wordml/cex" xmlns:w16="http://schemas.microsoft.com/office/word/2018/wordml" xmlns:w16sdtdh="http://schemas.microsoft.com/office/word/2020/wordml/sdtdatahash" xmlns:w16se="http://schemas.microsoft.com/office/word/2015/wordml/symex" xmlns:wpg="http://schemas.microsoft.com/office/word/2010/wordprocessingGroup" xmlns:wpi="http://schemas.microsoft.com/office/word/2010/wordprocessingInk" xmlns:wne="http://schemas.microsoft.com/office/word/2006/wordml" xmlns:wps="http://schemas.microsoft.com/office/word/2010/wordprocessingShape">
   <w:p>
     <w:pPr>
@@ -12419,7 +12546,7 @@
 </w:ftr>
 </file>
 
-<file path=word/footnotes.xml><?xml version="1.0" encoding="utf-8"?>
+<file path=./word/footnotes.xml><?xml version="1.0" encoding="utf-8"?>
 <w:footnotes xmlns:wpc="http://schemas.microsoft.com/office/word/2010/wordprocessingCanvas" xmlns:cx="http://schemas.microsoft.com/office/drawing/2014/chartex" xmlns:cx1="http://schemas.microsoft.com/office/drawing/2015/9/8/chartex" xmlns:cx2="http://schemas.microsoft.com/office/drawing/2015/10/21/chartex" xmlns:cx3="http://schemas.microsoft.com/office/drawing/2016/5/9/chartex" xmlns:cx4="http://schemas.microsoft.com/office/drawing/2016/5/10/chartex" xmlns:cx5="http://schemas.microsoft.com/office/drawing/2016/5/11/chartex" xmlns:cx6="http://schemas.microsoft.com/office/drawing/2016/5/12/chartex" xmlns:cx7="http://schemas.microsoft.com/office/drawing/2016/5/13/chartex" xmlns:cx8="http://schemas.microsoft.com/office/drawing/2016/5/14/chartex" xmlns:mc="http://schemas.openxmlformats.org/markup-compatibility/2006" xmlns:aink="http://schemas.microsoft.com/office/drawing/2016/ink" xmlns:am3d="http://schemas.microsoft.com/office/drawing/2017/model3d" xmlns:o="urn:schemas-microsoft-com:office:office" xmlns:r="http://schemas.openxmlformats.org/officeDocument/2006/relationships" xmlns:m="http://schemas.openxmlformats.org/officeDocument/2006/math" xmlns:v="urn:schemas-microsoft-com:vml" xmlns:wp14="http://schemas.microsoft.com/office/word/2010/wordprocessingDrawing" xmlns:wp="http://schemas.openxmlformats.org/drawingml/2006/wordprocessingDrawing" xmlns:w10="urn:schemas-microsoft-com:office:word" xmlns:w="http://schemas.openxmlformats.org/wordprocessingml/2006/main" xmlns:w14="http://schemas.microsoft.com/office/word/2010/wordml" xmlns:w15="http://schemas.microsoft.com/office/word/2012/wordml" xmlns:w16cex="http://schemas.microsoft.com/office/word/2018/wordml/cex" xmlns:w16="http://schemas.microsoft.com/office/word/2018/wordml" xmlns:w16sdtdh="http://schemas.microsoft.com/office/word/2020/wordml/sdtdatahash" xmlns:w16se="http://schemas.microsoft.com/office/word/2015/wordml/symex" xmlns:wpg="http://schemas.microsoft.com/office/word/2010/wordprocessingGroup" xmlns:wpi="http://schemas.microsoft.com/office/word/2010/wordprocessingInk" xmlns:wne="http://schemas.microsoft.com/office/word/2006/wordml" xmlns:wps="http://schemas.microsoft.com/office/word/2010/wordprocessingShape">
   <w:footnote w:type="separator" w:id="-1">
     <w:p>
@@ -12438,7 +12565,7 @@
 </w:footnotes>
 </file>
 
-<file path=word/numbering.xml><?xml version="1.0" encoding="utf-8"?>
+<file path=./word/numbering.xml><?xml version="1.0" encoding="utf-8"?>
 <w:numbering xmlns:wpc="http://schemas.microsoft.com/office/word/2010/wordprocessingCanvas" xmlns:cx="http://schemas.microsoft.com/office/drawing/2014/chartex" xmlns:cx1="http://schemas.microsoft.com/office/drawing/2015/9/8/chartex" xmlns:cx2="http://schemas.microsoft.com/office/drawing/2015/10/21/chartex" xmlns:cx3="http://schemas.microsoft.com/office/drawing/2016/5/9/chartex" xmlns:cx4="http://schemas.microsoft.com/office/drawing/2016/5/10/chartex" xmlns:cx5="http://schemas.microsoft.com/office/drawing/2016/5/11/chartex" xmlns:cx6="http://schemas.microsoft.com/office/drawing/2016/5/12/chartex" xmlns:cx7="http://schemas.microsoft.com/office/drawing/2016/5/13/chartex" xmlns:cx8="http://schemas.microsoft.com/office/drawing/2016/5/14/chartex" xmlns:mc="http://schemas.openxmlformats.org/markup-compatibility/2006" xmlns:aink="http://schemas.microsoft.com/office/drawing/2016/ink" xmlns:am3d="http://schemas.microsoft.com/office/drawing/2017/model3d" xmlns:o="urn:schemas-microsoft-com:office:office" xmlns:r="http://schemas.openxmlformats.org/officeDocument/2006/relationships" xmlns:m="http://schemas.openxmlformats.org/officeDocument/2006/math" xmlns:v="urn:schemas-microsoft-com:vml" xmlns:wp14="http://schemas.microsoft.com/office/word/2010/wordprocessingDrawing" xmlns:wp="http://schemas.openxmlformats.org/drawingml/2006/wordprocessingDrawing" xmlns:w10="urn:schemas-microsoft-com:office:word" xmlns:w="http://schemas.openxmlformats.org/wordprocessingml/2006/main" xmlns:w14="http://schemas.microsoft.com/office/word/2010/wordml" xmlns:w15="http://schemas.microsoft.com/office/word/2012/wordml" xmlns:w16cex="http://schemas.microsoft.com/office/word/2018/wordml/cex" xmlns:w16="http://schemas.microsoft.com/office/word/2018/wordml" xmlns:w16sdtdh="http://schemas.microsoft.com/office/word/2020/wordml/sdtdatahash" xmlns:w16se="http://schemas.microsoft.com/office/word/2015/wordml/symex" xmlns:wpg="http://schemas.microsoft.com/office/word/2010/wordprocessingGroup" xmlns:wpi="http://schemas.microsoft.com/office/word/2010/wordprocessingInk" xmlns:wne="http://schemas.microsoft.com/office/word/2006/wordml" xmlns:wps="http://schemas.microsoft.com/office/word/2010/wordprocessingShape">
   <w:abstractNum w:abstractNumId="0">
     <w:nsid w:val="09842C46"/>
@@ -13565,7 +13692,723 @@
 </w:numbering>
 </file>
 
-<file path=word/styles.xml><?xml version="1.0" encoding="utf-8"?>
+<file path=./word/settings.xml><?xml version="1.0" encoding="utf-8"?>
+<w:settings xmlns:mc="http://schemas.openxmlformats.org/markup-compatibility/2006" xmlns:o="urn:schemas-microsoft-com:office:office" xmlns:r="http://schemas.openxmlformats.org/officeDocument/2006/relationships" xmlns:m="http://schemas.openxmlformats.org/officeDocument/2006/math" xmlns:v="urn:schemas-microsoft-com:vml" xmlns:w10="urn:schemas-microsoft-com:office:word" xmlns:w="http://schemas.openxmlformats.org/wordprocessingml/2006/main" xmlns:w14="http://schemas.microsoft.com/office/word/2010/wordml" xmlns:w15="http://schemas.microsoft.com/office/word/2012/wordml" xmlns:w16cex="http://schemas.microsoft.com/office/word/2018/wordml/cex" xmlns:w16="http://schemas.microsoft.com/office/word/2018/wordml" xmlns:w16sdtdh="http://schemas.microsoft.com/office/word/2020/wordml/sdtdatahash" xmlns:w16se="http://schemas.microsoft.com/office/word/2015/wordml/symex" xmlns:sl="http://schemas.openxmlformats.org/schemaLibrary/2006/main">
+  <w:zoom w:percent="100"/>
+  <w:displayBackgroundShape/>
+  <w:hideSpellingErrors/>
+  <w:proofState w:spelling="clean" w:grammar="clean"/>
+  <w:stylePaneFormatFilter w:val="3F01" w:allStyles="1" w:customStyles="0" w:latentStyles="0" w:stylesInUse="0" w:headingStyles="0" w:numberingStyles="0" w:tableStyles="0" w:directFormattingOnRuns="1" w:directFormattingOnParagraphs="1" w:directFormattingOnNumbering="1" w:directFormattingOnTables="1" w:clearFormatting="1" w:top3HeadingStyles="1" w:visibleStyles="0" w:alternateStyleNames="0"/>
+  <w:defaultTabStop w:val="720"/>
+  <w:drawingGridHorizontalSpacing w:val="26"/>
+  <w:drawingGridVerticalSpacing w:val="381"/>
+  <w:displayHorizontalDrawingGridEvery w:val="0"/>
+  <w:characterSpacingControl w:val="doNotCompress"/>
+  <w:compat>
+    <w:compatSetting w:name="compatibilityMode" w:uri="http://schemas.microsoft.com/office/word" w:val="15"/>
+    <w:compatSetting w:name="overrideTableStyleFontSizeAndJustification" w:uri="http://schemas.microsoft.com/office/word" w:val="1"/>
+    <w:compatSetting w:name="enableOpenTypeFeatures" w:uri="http://schemas.microsoft.com/office/word" w:val="1"/>
+    <w:compatSetting w:name="doNotFlipMirrorIndents" w:uri="http://schemas.microsoft.com/office/word" w:val="1"/>
+    <w:compatSetting w:name="differentiateMultirowTableHeaders" w:uri="http://schemas.microsoft.com/office/word" w:val="1"/>
+    <w:compatSetting w:name="useWord2013TrackBottomHyphenation" w:uri="http://schemas.microsoft.com/office/word" w:val="0"/>
+  </w:compat>
+  <w:rsids>
+    <w:rsidRoot w:val="00061669"/>
+    <w:rsid w:val="00000184"/>
+    <w:rsid w:val="0000112B"/>
+    <w:rsid w:val="0000668C"/>
+    <w:rsid w:val="000137C0"/>
+    <w:rsid w:val="0001442B"/>
+    <w:rsid w:val="0001596A"/>
+    <w:rsid w:val="00016084"/>
+    <w:rsid w:val="000161A8"/>
+    <w:rsid w:val="000217C1"/>
+    <w:rsid w:val="00021A25"/>
+    <w:rsid w:val="00024E68"/>
+    <w:rsid w:val="00024EB4"/>
+    <w:rsid w:val="00025C03"/>
+    <w:rsid w:val="00026B0D"/>
+    <w:rsid w:val="000415F2"/>
+    <w:rsid w:val="00043E8B"/>
+    <w:rsid w:val="00045ED5"/>
+    <w:rsid w:val="00061669"/>
+    <w:rsid w:val="00071DB6"/>
+    <w:rsid w:val="00076DF2"/>
+    <w:rsid w:val="00087688"/>
+    <w:rsid w:val="00091C31"/>
+    <w:rsid w:val="00092A44"/>
+    <w:rsid w:val="000958FC"/>
+    <w:rsid w:val="000A57CF"/>
+    <w:rsid w:val="000B42A4"/>
+    <w:rsid w:val="000B7864"/>
+    <w:rsid w:val="000C010D"/>
+    <w:rsid w:val="000C06B4"/>
+    <w:rsid w:val="000C37B2"/>
+    <w:rsid w:val="000C5284"/>
+    <w:rsid w:val="000C7A46"/>
+    <w:rsid w:val="000D07AB"/>
+    <w:rsid w:val="000D0DA7"/>
+    <w:rsid w:val="000D10DE"/>
+    <w:rsid w:val="000E22AD"/>
+    <w:rsid w:val="000E315B"/>
+    <w:rsid w:val="000E6176"/>
+    <w:rsid w:val="000F71FB"/>
+    <w:rsid w:val="00100E50"/>
+    <w:rsid w:val="001020AC"/>
+    <w:rsid w:val="00104046"/>
+    <w:rsid w:val="00105725"/>
+    <w:rsid w:val="00107DCB"/>
+    <w:rsid w:val="00115F00"/>
+    <w:rsid w:val="00116E26"/>
+    <w:rsid w:val="00132554"/>
+    <w:rsid w:val="00132D8F"/>
+    <w:rsid w:val="00134CBC"/>
+    <w:rsid w:val="00153C1D"/>
+    <w:rsid w:val="001552BD"/>
+    <w:rsid w:val="0015570E"/>
+    <w:rsid w:val="00172C69"/>
+    <w:rsid w:val="001761D2"/>
+    <w:rsid w:val="001801A7"/>
+    <w:rsid w:val="00180379"/>
+    <w:rsid w:val="00187191"/>
+    <w:rsid w:val="00194484"/>
+    <w:rsid w:val="00194AB1"/>
+    <w:rsid w:val="001A1272"/>
+    <w:rsid w:val="001A236D"/>
+    <w:rsid w:val="001A7739"/>
+    <w:rsid w:val="001B4F08"/>
+    <w:rsid w:val="001B77FD"/>
+    <w:rsid w:val="001C0D1B"/>
+    <w:rsid w:val="001C151B"/>
+    <w:rsid w:val="001D39A4"/>
+    <w:rsid w:val="001D6533"/>
+    <w:rsid w:val="001F443E"/>
+    <w:rsid w:val="001F4A92"/>
+    <w:rsid w:val="00204D17"/>
+    <w:rsid w:val="00207A4A"/>
+    <w:rsid w:val="002119DD"/>
+    <w:rsid w:val="00211CAC"/>
+    <w:rsid w:val="00212A48"/>
+    <w:rsid w:val="00221A4D"/>
+    <w:rsid w:val="0023012E"/>
+    <w:rsid w:val="0023262F"/>
+    <w:rsid w:val="002343E4"/>
+    <w:rsid w:val="0023467A"/>
+    <w:rsid w:val="00235559"/>
+    <w:rsid w:val="00237D2C"/>
+    <w:rsid w:val="002526E4"/>
+    <w:rsid w:val="00261EFB"/>
+    <w:rsid w:val="002643DD"/>
+    <w:rsid w:val="00271B68"/>
+    <w:rsid w:val="0027200B"/>
+    <w:rsid w:val="00280796"/>
+    <w:rsid w:val="00283D59"/>
+    <w:rsid w:val="002842C5"/>
+    <w:rsid w:val="002847F7"/>
+    <w:rsid w:val="00284B20"/>
+    <w:rsid w:val="00287F9C"/>
+    <w:rsid w:val="00287FFD"/>
+    <w:rsid w:val="00293F85"/>
+    <w:rsid w:val="002950EC"/>
+    <w:rsid w:val="002A0F8F"/>
+    <w:rsid w:val="002B263E"/>
+    <w:rsid w:val="002B5C60"/>
+    <w:rsid w:val="002B5D53"/>
+    <w:rsid w:val="002C2FE6"/>
+    <w:rsid w:val="002D0485"/>
+    <w:rsid w:val="002D4E5F"/>
+    <w:rsid w:val="002D62BF"/>
+    <w:rsid w:val="002E0778"/>
+    <w:rsid w:val="002E1C82"/>
+    <w:rsid w:val="002E3E3D"/>
+    <w:rsid w:val="002E480A"/>
+    <w:rsid w:val="002F0097"/>
+    <w:rsid w:val="002F21EE"/>
+    <w:rsid w:val="002F238D"/>
+    <w:rsid w:val="002F781E"/>
+    <w:rsid w:val="00300B96"/>
+    <w:rsid w:val="003026C8"/>
+    <w:rsid w:val="00304D76"/>
+    <w:rsid w:val="00307CAC"/>
+    <w:rsid w:val="00310109"/>
+    <w:rsid w:val="0031170A"/>
+    <w:rsid w:val="003175A2"/>
+    <w:rsid w:val="003238E8"/>
+    <w:rsid w:val="00323D5A"/>
+    <w:rsid w:val="00324630"/>
+    <w:rsid w:val="00333426"/>
+    <w:rsid w:val="00333600"/>
+    <w:rsid w:val="00333D63"/>
+    <w:rsid w:val="003372E2"/>
+    <w:rsid w:val="003461EA"/>
+    <w:rsid w:val="00352375"/>
+    <w:rsid w:val="00356831"/>
+    <w:rsid w:val="003608B4"/>
+    <w:rsid w:val="00361600"/>
+    <w:rsid w:val="003620C6"/>
+    <w:rsid w:val="003635BE"/>
+    <w:rsid w:val="00371C07"/>
+    <w:rsid w:val="00376D1B"/>
+    <w:rsid w:val="00381E34"/>
+    <w:rsid w:val="00392ADE"/>
+    <w:rsid w:val="003A0AF6"/>
+    <w:rsid w:val="003A1ABD"/>
+    <w:rsid w:val="003A4A3C"/>
+    <w:rsid w:val="003A734E"/>
+    <w:rsid w:val="003A7699"/>
+    <w:rsid w:val="003B0FDC"/>
+    <w:rsid w:val="003B25AA"/>
+    <w:rsid w:val="003C1E34"/>
+    <w:rsid w:val="003C75F2"/>
+    <w:rsid w:val="003E3D68"/>
+    <w:rsid w:val="003E5A6E"/>
+    <w:rsid w:val="003E63B9"/>
+    <w:rsid w:val="003F0766"/>
+    <w:rsid w:val="003F1681"/>
+    <w:rsid w:val="003F289C"/>
+    <w:rsid w:val="003F74CB"/>
+    <w:rsid w:val="00403215"/>
+    <w:rsid w:val="00403C64"/>
+    <w:rsid w:val="00404A23"/>
+    <w:rsid w:val="0041711F"/>
+    <w:rsid w:val="0042013E"/>
+    <w:rsid w:val="00420FBA"/>
+    <w:rsid w:val="0042155B"/>
+    <w:rsid w:val="00422124"/>
+    <w:rsid w:val="00422E85"/>
+    <w:rsid w:val="004232CA"/>
+    <w:rsid w:val="00430066"/>
+    <w:rsid w:val="004351BF"/>
+    <w:rsid w:val="00435285"/>
+    <w:rsid w:val="00436155"/>
+    <w:rsid w:val="00444338"/>
+    <w:rsid w:val="00447775"/>
+    <w:rsid w:val="00450428"/>
+    <w:rsid w:val="00463B9B"/>
+    <w:rsid w:val="00463F1A"/>
+    <w:rsid w:val="0047191F"/>
+    <w:rsid w:val="00472F95"/>
+    <w:rsid w:val="004772CE"/>
+    <w:rsid w:val="004A1F10"/>
+    <w:rsid w:val="004A4625"/>
+    <w:rsid w:val="004A5121"/>
+    <w:rsid w:val="004B139E"/>
+    <w:rsid w:val="004B18E2"/>
+    <w:rsid w:val="004B3C94"/>
+    <w:rsid w:val="004C032A"/>
+    <w:rsid w:val="004C58C3"/>
+    <w:rsid w:val="004D43FA"/>
+    <w:rsid w:val="004D7D4A"/>
+    <w:rsid w:val="00500B8D"/>
+    <w:rsid w:val="00502AE5"/>
+    <w:rsid w:val="0050678D"/>
+    <w:rsid w:val="00507C62"/>
+    <w:rsid w:val="00516FC4"/>
+    <w:rsid w:val="0052227E"/>
+    <w:rsid w:val="005222EA"/>
+    <w:rsid w:val="00522579"/>
+    <w:rsid w:val="005306C7"/>
+    <w:rsid w:val="005331EE"/>
+    <w:rsid w:val="00537405"/>
+    <w:rsid w:val="00537829"/>
+    <w:rsid w:val="00543FA4"/>
+    <w:rsid w:val="00552044"/>
+    <w:rsid w:val="00557F34"/>
+    <w:rsid w:val="00564CEB"/>
+    <w:rsid w:val="00572248"/>
+    <w:rsid w:val="00585705"/>
+    <w:rsid w:val="00585C99"/>
+    <w:rsid w:val="005A06E2"/>
+    <w:rsid w:val="005A3248"/>
+    <w:rsid w:val="005B3644"/>
+    <w:rsid w:val="005B37F5"/>
+    <w:rsid w:val="005B3C2D"/>
+    <w:rsid w:val="005B5DCC"/>
+    <w:rsid w:val="005B77CE"/>
+    <w:rsid w:val="005C3804"/>
+    <w:rsid w:val="005C5C4F"/>
+    <w:rsid w:val="005C7185"/>
+    <w:rsid w:val="005D0BB1"/>
+    <w:rsid w:val="005D2CB8"/>
+    <w:rsid w:val="005D43F7"/>
+    <w:rsid w:val="005D6A3A"/>
+    <w:rsid w:val="005E0505"/>
+    <w:rsid w:val="005E0EAA"/>
+    <w:rsid w:val="005E5D97"/>
+    <w:rsid w:val="005F0198"/>
+    <w:rsid w:val="005F1A64"/>
+    <w:rsid w:val="005F1AB9"/>
+    <w:rsid w:val="005F2868"/>
+    <w:rsid w:val="005F398F"/>
+    <w:rsid w:val="005F4B12"/>
+    <w:rsid w:val="005F645E"/>
+    <w:rsid w:val="00600222"/>
+    <w:rsid w:val="0060085A"/>
+    <w:rsid w:val="00602FBB"/>
+    <w:rsid w:val="00604EDE"/>
+    <w:rsid w:val="00610902"/>
+    <w:rsid w:val="0061172E"/>
+    <w:rsid w:val="00611A73"/>
+    <w:rsid w:val="006154EE"/>
+    <w:rsid w:val="00622D74"/>
+    <w:rsid w:val="00623E5E"/>
+    <w:rsid w:val="00626114"/>
+    <w:rsid w:val="00626281"/>
+    <w:rsid w:val="00630FEC"/>
+    <w:rsid w:val="006343E5"/>
+    <w:rsid w:val="00635568"/>
+    <w:rsid w:val="00640821"/>
+    <w:rsid w:val="00640C7F"/>
+    <w:rsid w:val="00641DC2"/>
+    <w:rsid w:val="00650B89"/>
+    <w:rsid w:val="00656B4B"/>
+    <w:rsid w:val="00665667"/>
+    <w:rsid w:val="00667316"/>
+    <w:rsid w:val="00672A74"/>
+    <w:rsid w:val="00674084"/>
+    <w:rsid w:val="006759C5"/>
+    <w:rsid w:val="006812B4"/>
+    <w:rsid w:val="00681DBB"/>
+    <w:rsid w:val="006846E0"/>
+    <w:rsid w:val="00684700"/>
+    <w:rsid w:val="006943D5"/>
+    <w:rsid w:val="00695FFD"/>
+    <w:rsid w:val="00696993"/>
+    <w:rsid w:val="006A1AFF"/>
+    <w:rsid w:val="006A250B"/>
+    <w:rsid w:val="006A2BD0"/>
+    <w:rsid w:val="006A4335"/>
+    <w:rsid w:val="006A4A26"/>
+    <w:rsid w:val="006A6519"/>
+    <w:rsid w:val="006A67E3"/>
+    <w:rsid w:val="006B48E6"/>
+    <w:rsid w:val="006B780F"/>
+    <w:rsid w:val="006C0EB5"/>
+    <w:rsid w:val="006C3AE5"/>
+    <w:rsid w:val="006C47D8"/>
+    <w:rsid w:val="006C6F2B"/>
+    <w:rsid w:val="006D01D6"/>
+    <w:rsid w:val="006D231D"/>
+    <w:rsid w:val="006F10A2"/>
+    <w:rsid w:val="006F2604"/>
+    <w:rsid w:val="006F68BD"/>
+    <w:rsid w:val="006F7B2D"/>
+    <w:rsid w:val="0070318D"/>
+    <w:rsid w:val="00703242"/>
+    <w:rsid w:val="00705297"/>
+    <w:rsid w:val="007076DA"/>
+    <w:rsid w:val="00710057"/>
+    <w:rsid w:val="00710752"/>
+    <w:rsid w:val="00717D19"/>
+    <w:rsid w:val="00721502"/>
+    <w:rsid w:val="00722C42"/>
+    <w:rsid w:val="00724C9C"/>
+    <w:rsid w:val="00725CBD"/>
+    <w:rsid w:val="007339DB"/>
+    <w:rsid w:val="00735B02"/>
+    <w:rsid w:val="007366BE"/>
+    <w:rsid w:val="00750D1F"/>
+    <w:rsid w:val="00750E12"/>
+    <w:rsid w:val="00752391"/>
+    <w:rsid w:val="00752B24"/>
+    <w:rsid w:val="00755F64"/>
+    <w:rsid w:val="0076317A"/>
+    <w:rsid w:val="007649A5"/>
+    <w:rsid w:val="00770CF1"/>
+    <w:rsid w:val="0077253F"/>
+    <w:rsid w:val="00772EB0"/>
+    <w:rsid w:val="007756FC"/>
+    <w:rsid w:val="0077663E"/>
+    <w:rsid w:val="00780656"/>
+    <w:rsid w:val="00780A46"/>
+    <w:rsid w:val="00780D59"/>
+    <w:rsid w:val="00787F11"/>
+    <w:rsid w:val="007905C7"/>
+    <w:rsid w:val="00790DE9"/>
+    <w:rsid w:val="00793EF1"/>
+    <w:rsid w:val="007A0B2B"/>
+    <w:rsid w:val="007A3F76"/>
+    <w:rsid w:val="007A424C"/>
+    <w:rsid w:val="007A60ED"/>
+    <w:rsid w:val="007B22EB"/>
+    <w:rsid w:val="007C49D4"/>
+    <w:rsid w:val="007C5BB6"/>
+    <w:rsid w:val="007C65FA"/>
+    <w:rsid w:val="007D2340"/>
+    <w:rsid w:val="007D2478"/>
+    <w:rsid w:val="007D37EF"/>
+    <w:rsid w:val="007D617D"/>
+    <w:rsid w:val="007D65E5"/>
+    <w:rsid w:val="007E0DE3"/>
+    <w:rsid w:val="007E19FD"/>
+    <w:rsid w:val="007F1338"/>
+    <w:rsid w:val="007F1602"/>
+    <w:rsid w:val="007F2941"/>
+    <w:rsid w:val="00802679"/>
+    <w:rsid w:val="00806F0E"/>
+    <w:rsid w:val="00806FDB"/>
+    <w:rsid w:val="00810788"/>
+    <w:rsid w:val="0081380D"/>
+    <w:rsid w:val="00815A3F"/>
+    <w:rsid w:val="00823D07"/>
+    <w:rsid w:val="00824E7B"/>
+    <w:rsid w:val="0082502C"/>
+    <w:rsid w:val="008362E7"/>
+    <w:rsid w:val="008411FE"/>
+    <w:rsid w:val="0084345F"/>
+    <w:rsid w:val="008546AA"/>
+    <w:rsid w:val="00857865"/>
+    <w:rsid w:val="0086061E"/>
+    <w:rsid w:val="00865209"/>
+    <w:rsid w:val="00870BD6"/>
+    <w:rsid w:val="00870D45"/>
+    <w:rsid w:val="0087588A"/>
+    <w:rsid w:val="00877EB0"/>
+    <w:rsid w:val="00883A5C"/>
+    <w:rsid w:val="00885542"/>
+    <w:rsid w:val="00886BA7"/>
+    <w:rsid w:val="00891D11"/>
+    <w:rsid w:val="00896E83"/>
+    <w:rsid w:val="008A154E"/>
+    <w:rsid w:val="008A3474"/>
+    <w:rsid w:val="008B6965"/>
+    <w:rsid w:val="008C3416"/>
+    <w:rsid w:val="008D2F70"/>
+    <w:rsid w:val="008D7003"/>
+    <w:rsid w:val="008F006A"/>
+    <w:rsid w:val="008F06AA"/>
+    <w:rsid w:val="008F49FF"/>
+    <w:rsid w:val="008F6145"/>
+    <w:rsid w:val="008F67D9"/>
+    <w:rsid w:val="008F7A6E"/>
+    <w:rsid w:val="00913908"/>
+    <w:rsid w:val="00913B93"/>
+    <w:rsid w:val="009202BE"/>
+    <w:rsid w:val="0092360A"/>
+    <w:rsid w:val="009253A9"/>
+    <w:rsid w:val="009306FD"/>
+    <w:rsid w:val="00932794"/>
+    <w:rsid w:val="009327A6"/>
+    <w:rsid w:val="0093470D"/>
+    <w:rsid w:val="0094103B"/>
+    <w:rsid w:val="009469CF"/>
+    <w:rsid w:val="0095055F"/>
+    <w:rsid w:val="00952A14"/>
+    <w:rsid w:val="00954D7B"/>
+    <w:rsid w:val="00956F8A"/>
+    <w:rsid w:val="00957E44"/>
+    <w:rsid w:val="00962644"/>
+    <w:rsid w:val="009728DA"/>
+    <w:rsid w:val="00972B14"/>
+    <w:rsid w:val="00973DB1"/>
+    <w:rsid w:val="00984F7D"/>
+    <w:rsid w:val="009852E9"/>
+    <w:rsid w:val="0099080D"/>
+    <w:rsid w:val="009A2381"/>
+    <w:rsid w:val="009A3114"/>
+    <w:rsid w:val="009A3ED1"/>
+    <w:rsid w:val="009A4ECB"/>
+    <w:rsid w:val="009A620C"/>
+    <w:rsid w:val="009B12CA"/>
+    <w:rsid w:val="009B1988"/>
+    <w:rsid w:val="009B1CD8"/>
+    <w:rsid w:val="009B267B"/>
+    <w:rsid w:val="009B3911"/>
+    <w:rsid w:val="009B740E"/>
+    <w:rsid w:val="009C180C"/>
+    <w:rsid w:val="009C1F05"/>
+    <w:rsid w:val="009C31D4"/>
+    <w:rsid w:val="009C6ACC"/>
+    <w:rsid w:val="009C6DB8"/>
+    <w:rsid w:val="009C6E97"/>
+    <w:rsid w:val="009D0132"/>
+    <w:rsid w:val="009D3795"/>
+    <w:rsid w:val="009D4DFD"/>
+    <w:rsid w:val="009D77C5"/>
+    <w:rsid w:val="009E04EE"/>
+    <w:rsid w:val="009E12A3"/>
+    <w:rsid w:val="009E14CB"/>
+    <w:rsid w:val="009E3144"/>
+    <w:rsid w:val="009E564D"/>
+    <w:rsid w:val="009F6A35"/>
+    <w:rsid w:val="00A0678A"/>
+    <w:rsid w:val="00A130DE"/>
+    <w:rsid w:val="00A136CD"/>
+    <w:rsid w:val="00A13BB1"/>
+    <w:rsid w:val="00A27198"/>
+    <w:rsid w:val="00A27BB5"/>
+    <w:rsid w:val="00A30350"/>
+    <w:rsid w:val="00A40641"/>
+    <w:rsid w:val="00A443AA"/>
+    <w:rsid w:val="00A44ED7"/>
+    <w:rsid w:val="00A56F24"/>
+    <w:rsid w:val="00A646C0"/>
+    <w:rsid w:val="00A65F19"/>
+    <w:rsid w:val="00A66528"/>
+    <w:rsid w:val="00A73216"/>
+    <w:rsid w:val="00A73BAD"/>
+    <w:rsid w:val="00A774A0"/>
+    <w:rsid w:val="00A80CBE"/>
+    <w:rsid w:val="00A84CC7"/>
+    <w:rsid w:val="00A875DD"/>
+    <w:rsid w:val="00A9338B"/>
+    <w:rsid w:val="00A94169"/>
+    <w:rsid w:val="00A95BC2"/>
+    <w:rsid w:val="00A96AE2"/>
+    <w:rsid w:val="00AB72BA"/>
+    <w:rsid w:val="00AC2DA7"/>
+    <w:rsid w:val="00AC75FA"/>
+    <w:rsid w:val="00AC7A7B"/>
+    <w:rsid w:val="00AD00B4"/>
+    <w:rsid w:val="00AD11B3"/>
+    <w:rsid w:val="00AD39A5"/>
+    <w:rsid w:val="00AD56E8"/>
+    <w:rsid w:val="00AE265C"/>
+    <w:rsid w:val="00AF0882"/>
+    <w:rsid w:val="00AF1C5B"/>
+    <w:rsid w:val="00AF62CC"/>
+    <w:rsid w:val="00B00FDA"/>
+    <w:rsid w:val="00B036D1"/>
+    <w:rsid w:val="00B036E4"/>
+    <w:rsid w:val="00B05DAD"/>
+    <w:rsid w:val="00B07C1F"/>
+    <w:rsid w:val="00B10961"/>
+    <w:rsid w:val="00B1212A"/>
+    <w:rsid w:val="00B30186"/>
+    <w:rsid w:val="00B32540"/>
+    <w:rsid w:val="00B35DF0"/>
+    <w:rsid w:val="00B366F5"/>
+    <w:rsid w:val="00B45596"/>
+    <w:rsid w:val="00B4631D"/>
+    <w:rsid w:val="00B5039E"/>
+    <w:rsid w:val="00B54506"/>
+    <w:rsid w:val="00B55B8D"/>
+    <w:rsid w:val="00B56D57"/>
+    <w:rsid w:val="00B6159D"/>
+    <w:rsid w:val="00B6425B"/>
+    <w:rsid w:val="00B652CF"/>
+    <w:rsid w:val="00B668B3"/>
+    <w:rsid w:val="00B703E8"/>
+    <w:rsid w:val="00B729FB"/>
+    <w:rsid w:val="00B76C92"/>
+    <w:rsid w:val="00B83D46"/>
+    <w:rsid w:val="00B85739"/>
+    <w:rsid w:val="00B90662"/>
+    <w:rsid w:val="00B93BFA"/>
+    <w:rsid w:val="00B93E90"/>
+    <w:rsid w:val="00B97823"/>
+    <w:rsid w:val="00BA22A9"/>
+    <w:rsid w:val="00BA51CC"/>
+    <w:rsid w:val="00BA70D1"/>
+    <w:rsid w:val="00BA77CC"/>
+    <w:rsid w:val="00BB4F11"/>
+    <w:rsid w:val="00BC0CB3"/>
+    <w:rsid w:val="00BC0EAF"/>
+    <w:rsid w:val="00BC7F1E"/>
+    <w:rsid w:val="00BD0A95"/>
+    <w:rsid w:val="00BD0D3E"/>
+    <w:rsid w:val="00BD3EC9"/>
+    <w:rsid w:val="00BD62CF"/>
+    <w:rsid w:val="00BE1243"/>
+    <w:rsid w:val="00BE250D"/>
+    <w:rsid w:val="00BE34DF"/>
+    <w:rsid w:val="00BE36A0"/>
+    <w:rsid w:val="00BE465B"/>
+    <w:rsid w:val="00BF0B15"/>
+    <w:rsid w:val="00BF469C"/>
+    <w:rsid w:val="00C00C4B"/>
+    <w:rsid w:val="00C11DFD"/>
+    <w:rsid w:val="00C128F3"/>
+    <w:rsid w:val="00C152C8"/>
+    <w:rsid w:val="00C1554F"/>
+    <w:rsid w:val="00C16262"/>
+    <w:rsid w:val="00C1655A"/>
+    <w:rsid w:val="00C170D2"/>
+    <w:rsid w:val="00C174A6"/>
+    <w:rsid w:val="00C2076D"/>
+    <w:rsid w:val="00C2078A"/>
+    <w:rsid w:val="00C358D3"/>
+    <w:rsid w:val="00C45216"/>
+    <w:rsid w:val="00C527A8"/>
+    <w:rsid w:val="00C53784"/>
+    <w:rsid w:val="00C62759"/>
+    <w:rsid w:val="00C663BF"/>
+    <w:rsid w:val="00C7111B"/>
+    <w:rsid w:val="00C736C2"/>
+    <w:rsid w:val="00C74212"/>
+    <w:rsid w:val="00C76884"/>
+    <w:rsid w:val="00C7788E"/>
+    <w:rsid w:val="00C77C29"/>
+    <w:rsid w:val="00C81B6E"/>
+    <w:rsid w:val="00C82706"/>
+    <w:rsid w:val="00C9016A"/>
+    <w:rsid w:val="00C92F20"/>
+    <w:rsid w:val="00C93CA9"/>
+    <w:rsid w:val="00C94AA4"/>
+    <w:rsid w:val="00C9565D"/>
+    <w:rsid w:val="00CA0204"/>
+    <w:rsid w:val="00CA30DF"/>
+    <w:rsid w:val="00CB2F82"/>
+    <w:rsid w:val="00CC2424"/>
+    <w:rsid w:val="00CC2A33"/>
+    <w:rsid w:val="00CC4057"/>
+    <w:rsid w:val="00CD1F4C"/>
+    <w:rsid w:val="00CD2DBF"/>
+    <w:rsid w:val="00CE12EF"/>
+    <w:rsid w:val="00CE1B45"/>
+    <w:rsid w:val="00CE4270"/>
+    <w:rsid w:val="00CF05C3"/>
+    <w:rsid w:val="00CF37DF"/>
+    <w:rsid w:val="00D013E8"/>
+    <w:rsid w:val="00D02911"/>
+    <w:rsid w:val="00D155F0"/>
+    <w:rsid w:val="00D16013"/>
+    <w:rsid w:val="00D20550"/>
+    <w:rsid w:val="00D2077C"/>
+    <w:rsid w:val="00D20B6F"/>
+    <w:rsid w:val="00D21557"/>
+    <w:rsid w:val="00D2277A"/>
+    <w:rsid w:val="00D27637"/>
+    <w:rsid w:val="00D324EB"/>
+    <w:rsid w:val="00D342DC"/>
+    <w:rsid w:val="00D37645"/>
+    <w:rsid w:val="00D439E3"/>
+    <w:rsid w:val="00D43EEA"/>
+    <w:rsid w:val="00D506EC"/>
+    <w:rsid w:val="00D546A9"/>
+    <w:rsid w:val="00D60CAF"/>
+    <w:rsid w:val="00D61F6A"/>
+    <w:rsid w:val="00D62E50"/>
+    <w:rsid w:val="00D63235"/>
+    <w:rsid w:val="00D63A83"/>
+    <w:rsid w:val="00D66F83"/>
+    <w:rsid w:val="00D67159"/>
+    <w:rsid w:val="00D70160"/>
+    <w:rsid w:val="00D74A51"/>
+    <w:rsid w:val="00D80864"/>
+    <w:rsid w:val="00D86437"/>
+    <w:rsid w:val="00D90B11"/>
+    <w:rsid w:val="00D91987"/>
+    <w:rsid w:val="00D95805"/>
+    <w:rsid w:val="00DA6AED"/>
+    <w:rsid w:val="00DB046B"/>
+    <w:rsid w:val="00DB142B"/>
+    <w:rsid w:val="00DB2D55"/>
+    <w:rsid w:val="00DC02DA"/>
+    <w:rsid w:val="00DC4F49"/>
+    <w:rsid w:val="00DE0A7F"/>
+    <w:rsid w:val="00DE5E8F"/>
+    <w:rsid w:val="00DF4328"/>
+    <w:rsid w:val="00DF7DE1"/>
+    <w:rsid w:val="00E02CF6"/>
+    <w:rsid w:val="00E10D44"/>
+    <w:rsid w:val="00E12B17"/>
+    <w:rsid w:val="00E167B2"/>
+    <w:rsid w:val="00E20A4A"/>
+    <w:rsid w:val="00E21E44"/>
+    <w:rsid w:val="00E27605"/>
+    <w:rsid w:val="00E36363"/>
+    <w:rsid w:val="00E37DCF"/>
+    <w:rsid w:val="00E45A2D"/>
+    <w:rsid w:val="00E5189E"/>
+    <w:rsid w:val="00E651CC"/>
+    <w:rsid w:val="00E741BB"/>
+    <w:rsid w:val="00E75D35"/>
+    <w:rsid w:val="00E90F1B"/>
+    <w:rsid w:val="00E92916"/>
+    <w:rsid w:val="00E93626"/>
+    <w:rsid w:val="00EA2B23"/>
+    <w:rsid w:val="00EA3898"/>
+    <w:rsid w:val="00EA3C52"/>
+    <w:rsid w:val="00EA695E"/>
+    <w:rsid w:val="00EB4DCE"/>
+    <w:rsid w:val="00EC02FE"/>
+    <w:rsid w:val="00EC12D9"/>
+    <w:rsid w:val="00EC6086"/>
+    <w:rsid w:val="00ED4B3A"/>
+    <w:rsid w:val="00EE0687"/>
+    <w:rsid w:val="00EE297D"/>
+    <w:rsid w:val="00EF2A43"/>
+    <w:rsid w:val="00EF448C"/>
+    <w:rsid w:val="00F0176F"/>
+    <w:rsid w:val="00F02D94"/>
+    <w:rsid w:val="00F06A11"/>
+    <w:rsid w:val="00F1017D"/>
+    <w:rsid w:val="00F15533"/>
+    <w:rsid w:val="00F227C1"/>
+    <w:rsid w:val="00F27D11"/>
+    <w:rsid w:val="00F27D69"/>
+    <w:rsid w:val="00F32D74"/>
+    <w:rsid w:val="00F32FC5"/>
+    <w:rsid w:val="00F377ED"/>
+    <w:rsid w:val="00F4023B"/>
+    <w:rsid w:val="00F44C9C"/>
+    <w:rsid w:val="00F45A86"/>
+    <w:rsid w:val="00F555AE"/>
+    <w:rsid w:val="00F55E6E"/>
+    <w:rsid w:val="00F62FB5"/>
+    <w:rsid w:val="00F649A7"/>
+    <w:rsid w:val="00F64E9E"/>
+    <w:rsid w:val="00F6709D"/>
+    <w:rsid w:val="00F67CF8"/>
+    <w:rsid w:val="00F71F39"/>
+    <w:rsid w:val="00F74E9C"/>
+    <w:rsid w:val="00F75D60"/>
+    <w:rsid w:val="00F812A7"/>
+    <w:rsid w:val="00F859B0"/>
+    <w:rsid w:val="00F90085"/>
+    <w:rsid w:val="00F93ADA"/>
+    <w:rsid w:val="00FA1F38"/>
+    <w:rsid w:val="00FA1F4E"/>
+    <w:rsid w:val="00FB0246"/>
+    <w:rsid w:val="00FB0419"/>
+    <w:rsid w:val="00FB1A2A"/>
+    <w:rsid w:val="00FB4070"/>
+    <w:rsid w:val="00FB426E"/>
+    <w:rsid w:val="00FB4A2A"/>
+    <w:rsid w:val="00FB5964"/>
+    <w:rsid w:val="00FC096D"/>
+    <w:rsid w:val="00FC2E53"/>
+    <w:rsid w:val="00FD6540"/>
+    <w:rsid w:val="00FE2514"/>
+    <w:rsid w:val="00FE470F"/>
+    <w:rsid w:val="00FE4875"/>
+    <w:rsid w:val="00FE614D"/>
+    <w:rsid w:val="00FE7D03"/>
+    <w:rsid w:val="00FF02B7"/>
+    <w:rsid w:val="00FF09A7"/>
+    <w:rsid w:val="00FF2A0B"/>
+  </w:rsids>
+  <m:mathPr>
+    <m:mathFont m:val="Cambria Math"/>
+    <m:brkBin m:val="before"/>
+    <m:brkBinSub m:val="--"/>
+    <m:smallFrac m:val="0"/>
+    <m:dispDef/>
+    <m:lMargin m:val="0"/>
+    <m:rMargin m:val="0"/>
+    <m:defJc m:val="centerGroup"/>
+    <m:wrapIndent m:val="1440"/>
+    <m:intLim m:val="subSup"/>
+    <m:naryLim m:val="undOvr"/>
+  </m:mathPr>
+  <w:themeFontLang w:val="en-US" w:eastAsia="zh-CN"/>
+  <w:clrSchemeMapping w:bg1="light1" w:t1="dark1" w:bg2="light2" w:t2="dark2" w:accent1="accent1" w:accent2="accent2" w:accent3="accent3" w:accent4="accent4" w:accent5="accent5" w:accent6="accent6" w:hyperlink="hyperlink" w:followedHyperlink="followedHyperlink"/>
+  <w:doNotIncludeSubdocsInStats/>
+  <w:shapeDefaults>
+    <o:shapedefaults v:ext="edit" spidmax="1026"/>
+    <o:shapelayout v:ext="edit">
+      <o:idmap v:ext="edit" data="1"/>
+    </o:shapelayout>
+  </w:shapeDefaults>
+  <w:decimalSymbol w:val=","/>
+  <w:listSeparator w:val=","/>
+  <w14:docId w14:val="7F363E59"/>
+  <w15:docId w15:val="{DF941DE2-7CBE-4706-B7D3-78D51C5D7488}"/>
+</w:settings>
+</file>
+
+<file path=./word/styles.xml><?xml version="1.0" encoding="utf-8"?>
 <w:styles xmlns:mc="http://schemas.openxmlformats.org/markup-compatibility/2006" xmlns:r="http://schemas.openxmlformats.org/officeDocument/2006/relationships" xmlns:w="http://schemas.openxmlformats.org/wordprocessingml/2006/main" xmlns:w14="http://schemas.microsoft.com/office/word/2010/wordml" xmlns:w15="http://schemas.microsoft.com/office/word/2012/wordml" xmlns:w16cex="http://schemas.microsoft.com/office/word/2018/wordml/cex" xmlns:w16="http://schemas.microsoft.com/office/word/2018/wordml" xmlns:w16sdtdh="http://schemas.microsoft.com/office/word/2020/wordml/sdtdatahash" xmlns:w16se="http://schemas.microsoft.com/office/word/2015/wordml/symex">
   <w:docDefaults>
     <w:rPrDefault>
@@ -14128,7 +14971,7 @@
 </w:styles>
 </file>
 
-<file path=word/theme/theme1.xml><?xml version="1.0" encoding="utf-8"?>
+<file path=./word/theme/theme1.xml><?xml version="1.0" encoding="utf-8"?>
 <a:theme xmlns:a="http://schemas.openxmlformats.org/drawingml/2006/main" name="Office Theme">
   <a:themeElements>
     <a:clrScheme name="Office">
@@ -14409,4 +15252,12 @@
   <a:objectDefaults/>
   <a:extraClrSchemeLst/>
 </a:theme>
+</file>
+
+<file path=./word/webSettings.xml><?xml version="1.0" encoding="utf-8"?>
+<w:webSettings xmlns:mc="http://schemas.openxmlformats.org/markup-compatibility/2006" xmlns:r="http://schemas.openxmlformats.org/officeDocument/2006/relationships" xmlns:w="http://schemas.openxmlformats.org/wordprocessingml/2006/main" xmlns:w14="http://schemas.microsoft.com/office/word/2010/wordml" xmlns:w15="http://schemas.microsoft.com/office/word/2012/wordml" xmlns:w16cex="http://schemas.microsoft.com/office/word/2018/wordml/cex" xmlns:w16="http://schemas.microsoft.com/office/word/2018/wordml" xmlns:w16sdtdh="http://schemas.microsoft.com/office/word/2020/wordml/sdtdatahash" xmlns:w16se="http://schemas.microsoft.com/office/word/2015/wordml/symex">
+  <w:optimizeForBrowser/>
+  <w:relyOnVML/>
+  <w:allowPNG/>
+</w:webSettings>
 </file>
</xml_diff>